<commit_message>
feat(inbox/aan): Book 04 HRIT Identity & Org SSOT briefing deck + figure write-back
New 22-slide Book 04 briefing per the series authoring spec: FedRAMP
Moderate only, Date Code on title + all footers, full sourced speaker
notes, four build sequences (fragmented truth 2-step, JML event stream
3-step, organizational SSOT 2-step, phased implementation 2-step).
Deck deployed to OneDrive alongside the docx.

Spec section 4 write-back (3 augments; 4 existing hrit-figs cover the
rest as skips, tables stay tables):
- hrit-fig-05 six-step leaver sequence — Deprovisioning section had no
  figure
- hrit-fig-06 inbound provisioning pipeline — HR-Driven Provisioning
  section had no figure
- hrit-fig-07 four implementation phases with gates — Phased
  Implementation section had no figure
Book Date Code 2026-07-07 10:54 ET; docx re-rendered from qmd.

Co-Authored-By: Claude Fable 5 <noreply@anthropic.com>
</commit_message>
<xml_diff>
--- a/inbox/Application Aware Networking/Book_04_FedAAN_HRIT_Identity_Org_SSOT.docx
+++ b/inbox/Application Aware Networking/Book_04_FedAAN_HRIT_Identity_Org_SSOT.docx
@@ -31,7 +31,7 @@
         <w:pStyle w:val="Date"/>
       </w:pPr>
       <w:r>
-        <w:t xml:space="preserve">2026-07-06</w:t>
+        <w:t xml:space="preserve">Invalid Date</w:t>
       </w:r>
     </w:p>
     <w:sdt>
@@ -114,7 +114,7 @@
                     <a:graphicData uri="http://schemas.openxmlformats.org/drawingml/2006/picture">
                       <pic:pic>
                         <pic:nvPicPr>
-                          <pic:cNvPr descr="/opt/quarto/share/formats/docx/warning.png" id="11" name="Picture"/>
+                          <pic:cNvPr descr="C:\Program Files\Quarto\share\formats\docx\warning.png" id="11" name="Picture"/>
                           <pic:cNvPicPr>
                             <a:picLocks noChangeArrowheads="1" noChangeAspect="1"/>
                           </pic:cNvPicPr>
@@ -174,7 +174,7 @@
               <w:pStyle w:val="BodyText"/>
             </w:pPr>
             <w:pPr>
-              <w:spacing w:before="16" w:after="16"/>
+              <w:spacing w:before="16"/>
             </w:pPr>
             <w:r>
               <w:t xml:space="preserve">This document is a</w:t>
@@ -207,6 +207,27 @@
             </w:r>
             <w:r>
               <w:t xml:space="preserve">. It is an attempt at a comprehensive SSA-wide technical roadmap and has not been reviewed or approved by the SSA CIO Office, the Office of Information Security (OIS), or organizational leadership. All recommendations, vendor selections, control mappings, and implementation timelines are subject to revision pending formal review by the SSA CIO Office and organizational components.</w:t>
+            </w:r>
+          </w:p>
+          <w:p>
+            <w:pPr>
+              <w:pStyle w:val="BodyText"/>
+            </w:pPr>
+            <w:pPr>
+              <w:spacing w:after="16"/>
+            </w:pPr>
+            <w:r>
+              <w:rPr>
+                <w:b/>
+                <w:bCs/>
+              </w:rPr>
+              <w:t xml:space="preserve">Date Code:</w:t>
+            </w:r>
+            <w:r>
+              <w:t xml:space="preserve"> </w:t>
+            </w:r>
+            <w:r>
+              <w:t xml:space="preserve">2026-07-07 10:54 ET</w:t>
             </w:r>
           </w:p>
           <w:p/>
@@ -267,7 +288,7 @@
                     <a:graphicData uri="http://schemas.openxmlformats.org/drawingml/2006/picture">
                       <pic:pic>
                         <pic:nvPicPr>
-                          <pic:cNvPr descr="/opt/quarto/share/formats/docx/important.png" id="14" name="Picture"/>
+                          <pic:cNvPr descr="C:\Program Files\Quarto\share\formats\docx\important.png" id="14" name="Picture"/>
                           <pic:cNvPicPr>
                             <a:picLocks noChangeArrowheads="1" noChangeAspect="1"/>
                           </pic:cNvPicPr>
@@ -885,7 +906,7 @@
                     <a:graphicData uri="http://schemas.openxmlformats.org/drawingml/2006/picture">
                       <pic:pic>
                         <pic:nvPicPr>
-                          <pic:cNvPr descr="/opt/quarto/share/formats/docx/note.png" id="22" name="Picture"/>
+                          <pic:cNvPr descr="C:\Program Files\Quarto\share\formats\docx\note.png" id="22" name="Picture"/>
                           <pic:cNvPicPr>
                             <a:picLocks noChangeArrowheads="1" noChangeAspect="1"/>
                           </pic:cNvPicPr>
@@ -1048,7 +1069,7 @@
                     <a:graphicData uri="http://schemas.openxmlformats.org/drawingml/2006/picture">
                       <pic:pic>
                         <pic:nvPicPr>
-                          <pic:cNvPr descr="/opt/quarto/share/formats/docx/note.png" id="24" name="Picture"/>
+                          <pic:cNvPr descr="C:\Program Files\Quarto\share\formats\docx\note.png" id="24" name="Picture"/>
                           <pic:cNvPicPr>
                             <a:picLocks noChangeArrowheads="1" noChangeAspect="1"/>
                           </pic:cNvPicPr>
@@ -3555,7 +3576,7 @@
     </w:tbl>
     <w:bookmarkEnd w:id="43"/>
     <w:bookmarkEnd w:id="44"/>
-    <w:bookmarkStart w:id="55" w:name="the-identity-ssot"/>
+    <w:bookmarkStart w:id="63" w:name="the-identity-ssot"/>
     <w:p>
       <w:pPr>
         <w:pStyle w:val="Heading1"/>
@@ -4150,7 +4171,7 @@
       </w:tr>
     </w:tbl>
     <w:bookmarkEnd w:id="49"/>
-    <w:bookmarkStart w:id="50" w:name="X448f77dc5d62c73b880d5374cd77a9bd610a269"/>
+    <w:bookmarkStart w:id="54" w:name="X448f77dc5d62c73b880d5374cd77a9bd610a269"/>
     <w:p>
       <w:pPr>
         <w:pStyle w:val="Heading2"/>
@@ -4411,1269 +4432,6 @@
       </w:r>
       <w:r>
         <w:t xml:space="preserve">source and the only one whose middleware layer can compute organizational attributes and emit provenance before the identity platform ever sees the record.</w:t>
-      </w:r>
-    </w:p>
-    <w:bookmarkEnd w:id="50"/>
-    <w:bookmarkStart w:id="51" w:name="one-person-one-identifier"/>
-    <w:p>
-      <w:pPr>
-        <w:pStyle w:val="Heading2"/>
-      </w:pPr>
-      <w:r>
-        <w:t xml:space="preserve">4.3 One Person, One Identifier</w:t>
-      </w:r>
-    </w:p>
-    <w:p>
-      <w:pPr>
-        <w:pStyle w:val="FirstParagraph"/>
-      </w:pPr>
-      <w:r>
-        <w:t xml:space="preserve">IA-4 requires managing identifiers by receiving authorization to assign them, selecting and assigning them to the intended entity, and</w:t>
-      </w:r>
-      <w:r>
-        <w:t xml:space="preserve"> </w:t>
-      </w:r>
-      <w:r>
-        <w:rPr>
-          <w:b/>
-          <w:bCs/>
-        </w:rPr>
-        <w:t xml:space="preserve">preventing their reuse</w:t>
-      </w:r>
-      <w:r>
-        <w:t xml:space="preserve"> </w:t>
-      </w:r>
-      <w:r>
-        <w:t xml:space="preserve">for a defined period. The enterprise discipline this architecture implements is stricter and simpler:</w:t>
-      </w:r>
-      <w:r>
-        <w:t xml:space="preserve"> </w:t>
-      </w:r>
-      <w:r>
-        <w:rPr>
-          <w:b/>
-          <w:bCs/>
-        </w:rPr>
-        <w:t xml:space="preserve">one person, one identifier, for the life of the affiliation — across every account, system, rehire, and conversion.</w:t>
-      </w:r>
-    </w:p>
-    <w:p>
-      <w:pPr>
-        <w:pStyle w:val="BodyText"/>
-      </w:pPr>
-      <w:r>
-        <w:t xml:space="preserve">The</w:t>
-      </w:r>
-      <w:r>
-        <w:t xml:space="preserve"> </w:t>
-      </w:r>
-      <w:r>
-        <w:rPr>
-          <w:rStyle w:val="VerbatimChar"/>
-        </w:rPr>
-        <w:t xml:space="preserve">employeeId</w:t>
-      </w:r>
-      <w:r>
-        <w:t xml:space="preserve"> </w:t>
-      </w:r>
-      <w:r>
-        <w:t xml:space="preserve">assigned at first affiliation is the immutable correlation anchor. It never changes with name, position, region, or worker type; every account in every system that belongs to the person carries it; and when the person returns after a break in service, the rehire event re-links the</w:t>
-      </w:r>
-      <w:r>
-        <w:t xml:space="preserve"> </w:t>
-      </w:r>
-      <w:r>
-        <w:rPr>
-          <w:i/>
-          <w:iCs/>
-        </w:rPr>
-        <w:t xml:space="preserve">same</w:t>
-      </w:r>
-      <w:r>
-        <w:t xml:space="preserve"> </w:t>
-      </w:r>
-      <w:r>
-        <w:t xml:space="preserve">identifier rather than minting a fresh identity. This is only possible where the</w:t>
-      </w:r>
-      <w:r>
-        <w:t xml:space="preserve"> </w:t>
-      </w:r>
-      <w:r>
-        <w:rPr>
-          <w:i/>
-          <w:iCs/>
-        </w:rPr>
-        <w:t xml:space="preserve">person</w:t>
-      </w:r>
-      <w:r>
-        <w:t xml:space="preserve"> </w:t>
-      </w:r>
-      <w:r>
-        <w:t xml:space="preserve">— not the account — is the tracked entity. A directory cannot do it: directories track accounts, and an account deleted at separation takes its history with it. The worker record persists across affiliations, which is why identifier non-reuse and rehire correlation are properties of the HR plane, projected downward.</w:t>
-      </w:r>
-    </w:p>
-    <w:p>
-      <w:pPr>
-        <w:pStyle w:val="BodyText"/>
-      </w:pPr>
-      <w:r>
-        <w:t xml:space="preserve">The same anchor is what makes audit joins possible at all: the token event in the SIEM, the database login, the badge swipe, and the personnel action resolve to one person only because one identifier threads them.</w:t>
-      </w:r>
-    </w:p>
-    <w:bookmarkEnd w:id="51"/>
-    <w:bookmarkStart w:id="52" w:name="the-worker-type-boundary"/>
-    <w:p>
-      <w:pPr>
-        <w:pStyle w:val="Heading2"/>
-      </w:pPr>
-      <w:r>
-        <w:t xml:space="preserve">4.4 The Worker-Type Boundary</w:t>
-      </w:r>
-    </w:p>
-    <w:p>
-      <w:pPr>
-        <w:pStyle w:val="FirstParagraph"/>
-      </w:pPr>
-      <w:r>
-        <w:t xml:space="preserve">One authoritative attribute deserves special notice because entire policy families hang from it:</w:t>
-      </w:r>
-      <w:r>
-        <w:t xml:space="preserve"> </w:t>
-      </w:r>
-      <w:r>
-        <w:rPr>
-          <w:b/>
-          <w:bCs/>
-        </w:rPr>
-        <w:t xml:space="preserve">worker type.</w:t>
-      </w:r>
-      <w:r>
-        <w:t xml:space="preserve"> </w:t>
-      </w:r>
-      <w:r>
-        <w:t xml:space="preserve">Employee, contractor, intern, volunteer — the classification determines member-versus-guest treatment in the tenant, license assignment, access ceilings, and which conditional-access baseline applies. When worker type is a directory field someone sets at account creation, it is wrong exactly as often as staffing paperwork is ambiguous, and the errors are invisible because nothing reconciles them. When it is derived from the worker record, the contractor whose engagement ends loses access on the engagement’s end date (a leaver event for a non-employee), and the conversion seam — contractor on Friday, employee on Monday — is a re-derivation on the same identifier rather than a second identity with a second, forgotten first account. IA-4(4)’s status characterization (identifying each individual as, for example, a contractor) falls out of the same attribute for free: the characteristic is asserted by the system that classifies workers as a business act, not annotated by an administrator who heard about it.</w:t>
-      </w:r>
-    </w:p>
-    <w:bookmarkEnd w:id="52"/>
-    <w:bookmarkStart w:id="53" w:name="X6425fd18b5c4f116f10f22295a2c67df893cf44"/>
-    <w:p>
-      <w:pPr>
-        <w:pStyle w:val="Heading2"/>
-      </w:pPr>
-      <w:r>
-        <w:t xml:space="preserve">4.5 Deprovisioning Is an HR Event, Not a Ticket</w:t>
-      </w:r>
-    </w:p>
-    <w:p>
-      <w:pPr>
-        <w:pStyle w:val="FirstParagraph"/>
-      </w:pPr>
-      <w:r>
-        <w:t xml:space="preserve">The leaver sequence deserves its own statement, because it is where the fragmented-truth architecture kills its audit findings — and occasionally its incident reports. In the target state, separation processing is initiated by the effective-dated termination record, and the automated sequence executes on that date, in order, as one workflow:</w:t>
-      </w:r>
-    </w:p>
-    <w:p>
-      <w:pPr>
-        <w:pStyle w:val="Compact"/>
-        <w:numPr>
-          <w:ilvl w:val="0"/>
-          <w:numId w:val="1006"/>
-        </w:numPr>
-      </w:pPr>
-      <w:r>
-        <w:rPr>
-          <w:b/>
-          <w:bCs/>
-        </w:rPr>
-        <w:t xml:space="preserve">Disable the account</w:t>
-      </w:r>
-      <w:r>
-        <w:t xml:space="preserve"> </w:t>
-      </w:r>
-      <w:r>
-        <w:t xml:space="preserve">— the sign-in gate closes first.</w:t>
-      </w:r>
-    </w:p>
-    <w:p>
-      <w:pPr>
-        <w:pStyle w:val="Compact"/>
-        <w:numPr>
-          <w:ilvl w:val="0"/>
-          <w:numId w:val="1006"/>
-        </w:numPr>
-      </w:pPr>
-      <w:r>
-        <w:rPr>
-          <w:b/>
-          <w:bCs/>
-        </w:rPr>
-        <w:t xml:space="preserve">Revoke active sessions and refresh tokens</w:t>
-      </w:r>
-      <w:r>
-        <w:t xml:space="preserve"> </w:t>
-      </w:r>
-      <w:r>
-        <w:t xml:space="preserve">— disabling prevents</w:t>
-      </w:r>
-      <w:r>
-        <w:t xml:space="preserve"> </w:t>
-      </w:r>
-      <w:r>
-        <w:rPr>
-          <w:i/>
-          <w:iCs/>
-        </w:rPr>
-        <w:t xml:space="preserve">new</w:t>
-      </w:r>
-      <w:r>
-        <w:t xml:space="preserve"> </w:t>
-      </w:r>
-      <w:r>
-        <w:t xml:space="preserve">tokens; revocation ends the ones already issued, so the control takes effect in token-lifetime minutes rather than at next sign-in.</w:t>
-      </w:r>
-    </w:p>
-    <w:p>
-      <w:pPr>
-        <w:pStyle w:val="Compact"/>
-        <w:numPr>
-          <w:ilvl w:val="0"/>
-          <w:numId w:val="1006"/>
-        </w:numPr>
-      </w:pPr>
-      <w:r>
-        <w:rPr>
-          <w:b/>
-          <w:bCs/>
-        </w:rPr>
-        <w:t xml:space="preserve">Verify</w:t>
-      </w:r>
-      <w:r>
-        <w:t xml:space="preserve"> </w:t>
-      </w:r>
-      <w:r>
-        <w:t xml:space="preserve">— read back the revocation state; a step that cannot be confirmed is a step that did not happen, as far as evidence is concerned.</w:t>
-      </w:r>
-    </w:p>
-    <w:p>
-      <w:pPr>
-        <w:pStyle w:val="Compact"/>
-        <w:numPr>
-          <w:ilvl w:val="0"/>
-          <w:numId w:val="1006"/>
-        </w:numPr>
-      </w:pPr>
-      <w:r>
-        <w:rPr>
-          <w:b/>
-          <w:bCs/>
-        </w:rPr>
-        <w:t xml:space="preserve">Remove group memberships and access-package assignments</w:t>
-      </w:r>
-      <w:r>
-        <w:t xml:space="preserve"> </w:t>
-      </w:r>
-      <w:r>
-        <w:t xml:space="preserve">— entitlements end even where a downstream application caches identity.</w:t>
-      </w:r>
-    </w:p>
-    <w:p>
-      <w:pPr>
-        <w:pStyle w:val="Compact"/>
-        <w:numPr>
-          <w:ilvl w:val="0"/>
-          <w:numId w:val="1006"/>
-        </w:numPr>
-      </w:pPr>
-      <w:r>
-        <w:rPr>
-          <w:b/>
-          <w:bCs/>
-        </w:rPr>
-        <w:t xml:space="preserve">Revoke credentials</w:t>
-      </w:r>
-      <w:r>
-        <w:t xml:space="preserve"> </w:t>
-      </w:r>
-      <w:r>
-        <w:t xml:space="preserve">— certificates through the Book 03 lifecycle; the device’s admission credential through the Book 02 pipeline, so the port stops trusting the hardware too.</w:t>
-      </w:r>
-    </w:p>
-    <w:p>
-      <w:pPr>
-        <w:pStyle w:val="Compact"/>
-        <w:numPr>
-          <w:ilvl w:val="0"/>
-          <w:numId w:val="1006"/>
-        </w:numPr>
-      </w:pPr>
-      <w:r>
-        <w:rPr>
-          <w:b/>
-          <w:bCs/>
-        </w:rPr>
-        <w:t xml:space="preserve">Disposition data</w:t>
-      </w:r>
-      <w:r>
-        <w:t xml:space="preserve"> </w:t>
-      </w:r>
-      <w:r>
-        <w:t xml:space="preserve">— mailbox archive or conversion, file ownership transfer, retention and litigation-hold exceptions applied per policy rather than per memory.</w:t>
-      </w:r>
-    </w:p>
-    <w:p>
-      <w:pPr>
-        <w:pStyle w:val="FirstParagraph"/>
-      </w:pPr>
-      <w:r>
-        <w:t xml:space="preserve">Each step emits a timestamped evidence record; the</w:t>
-      </w:r>
-      <w:r>
-        <w:t xml:space="preserve"> </w:t>
-      </w:r>
-      <w:r>
-        <w:rPr>
-          <w:i/>
-          <w:iCs/>
-        </w:rPr>
-        <w:t xml:space="preserve">distance between the HR effective date and the last revocation timestamp</w:t>
-      </w:r>
-      <w:r>
-        <w:t xml:space="preserve"> </w:t>
-      </w:r>
-      <w:r>
-        <w:t xml:space="preserve">becomes a measured, reportable ConMon metric instead of an unknowable. Emergency terminations take a defined manual entry into the</w:t>
-      </w:r>
-      <w:r>
-        <w:t xml:space="preserve"> </w:t>
-      </w:r>
-      <w:r>
-        <w:rPr>
-          <w:i/>
-          <w:iCs/>
-        </w:rPr>
-        <w:t xml:space="preserve">same</w:t>
-      </w:r>
-      <w:r>
-        <w:t xml:space="preserve"> </w:t>
-      </w:r>
-      <w:r>
-        <w:t xml:space="preserve">sequence — the trigger is human, the execution and the evidence are identical.</w:t>
-      </w:r>
-    </w:p>
-    <w:p>
-      <w:pPr>
-        <w:pStyle w:val="BodyText"/>
-      </w:pPr>
-      <w:r>
-        <w:t xml:space="preserve">Contrast the input signals available to any alternative mechanism. The network cannot see a termination — the leaver’s laptop authenticates on their last day exactly as it did the day before. The SIEM sees</w:t>
-      </w:r>
-      <w:r>
-        <w:t xml:space="preserve"> </w:t>
-      </w:r>
-      <w:r>
-        <w:rPr>
-          <w:i/>
-          <w:iCs/>
-        </w:rPr>
-        <w:t xml:space="preserve">absence of activity</w:t>
-      </w:r>
-      <w:r>
-        <w:t xml:space="preserve">, which is indistinguishable from leave. The quarterly access review discovers the account up to ninety days late. Only one system in the enterprise records the separation as a first-class fact with an effective date — and once it does, everything downstream is a subscription.</w:t>
-      </w:r>
-    </w:p>
-    <w:bookmarkEnd w:id="53"/>
-    <w:bookmarkStart w:id="54" w:name="the-measured-lifecycle"/>
-    <w:p>
-      <w:pPr>
-        <w:pStyle w:val="Heading2"/>
-      </w:pPr>
-      <w:r>
-        <w:t xml:space="preserve">4.6 The Measured Lifecycle</w:t>
-      </w:r>
-    </w:p>
-    <w:p>
-      <w:pPr>
-        <w:pStyle w:val="FirstParagraph"/>
-      </w:pPr>
-      <w:r>
-        <w:t xml:space="preserve">An event-driven lifecycle is also, incidentally but not accidentally, a</w:t>
-      </w:r>
-      <w:r>
-        <w:t xml:space="preserve"> </w:t>
-      </w:r>
-      <w:r>
-        <w:rPr>
-          <w:i/>
-          <w:iCs/>
-        </w:rPr>
-        <w:t xml:space="preserve">measured</w:t>
-      </w:r>
-      <w:r>
-        <w:t xml:space="preserve"> </w:t>
-      </w:r>
-      <w:r>
-        <w:t xml:space="preserve">one — every event-to-action interval is a number, and the numbers are the slot-01 evidence stream:</w:t>
-      </w:r>
-    </w:p>
-    <w:p>
-      <w:pPr>
-        <w:pStyle w:val="TableCaption"/>
-      </w:pPr>
-      <w:r>
-        <w:t xml:space="preserve">The lifecycle metrics the event-driven architecture makes measurable</w:t>
-      </w:r>
-    </w:p>
-    <w:tbl>
-      <w:tblPr>
-        <w:tblStyle w:val="Table"/>
-        <w:tblW w:type="pct" w:w="5000"/>
-        <w:tblLayout w:type="fixed"/>
-        <w:tblLook w:firstRow="1" w:lastRow="0" w:firstColumn="0" w:lastColumn="0" w:noHBand="0" w:noVBand="0" w:val="0020"/>
-        <w:tblCaption w:val="The lifecycle metrics the event-driven architecture makes measurable"/>
-      </w:tblPr>
-      <w:tblGrid>
-        <w:gridCol w:w="2640"/>
-        <w:gridCol w:w="2640"/>
-        <w:gridCol w:w="2640"/>
-      </w:tblGrid>
-      <w:tr>
-        <w:trPr>
-          <w:tblHeader w:val="on"/>
-        </w:trPr>
-        <w:tc>
-          <w:tcPr/>
-          <w:p>
-            <w:pPr>
-              <w:pStyle w:val="Compact"/>
-            </w:pPr>
-            <w:r>
-              <w:t xml:space="preserve">Metric</w:t>
-            </w:r>
-          </w:p>
-        </w:tc>
-        <w:tc>
-          <w:tcPr/>
-          <w:p>
-            <w:pPr>
-              <w:pStyle w:val="Compact"/>
-            </w:pPr>
-            <w:r>
-              <w:t xml:space="preserve">Definition</w:t>
-            </w:r>
-          </w:p>
-        </w:tc>
-        <w:tc>
-          <w:tcPr/>
-          <w:p>
-            <w:pPr>
-              <w:pStyle w:val="Compact"/>
-            </w:pPr>
-            <w:r>
-              <w:t xml:space="preserve">What It Evidences</w:t>
-            </w:r>
-          </w:p>
-        </w:tc>
-      </w:tr>
-      <w:tr>
-        <w:tc>
-          <w:tcPr/>
-          <w:p>
-            <w:pPr>
-              <w:pStyle w:val="Compact"/>
-            </w:pPr>
-            <w:r>
-              <w:t xml:space="preserve">Separation-to-revocation interval</w:t>
-            </w:r>
-          </w:p>
-        </w:tc>
-        <w:tc>
-          <w:tcPr/>
-          <w:p>
-            <w:pPr>
-              <w:pStyle w:val="Compact"/>
-            </w:pPr>
-            <w:r>
-              <w:t xml:space="preserve">HR effective date/time → last revocation timestamp in the leaver sequence</w:t>
-            </w:r>
-          </w:p>
-        </w:tc>
-        <w:tc>
-          <w:tcPr/>
-          <w:p>
-            <w:pPr>
-              <w:pStyle w:val="Compact"/>
-            </w:pPr>
-            <w:r>
-              <w:t xml:space="preserve">PS-4’s disable-within-time-period, continuously</w:t>
-            </w:r>
-          </w:p>
-        </w:tc>
-      </w:tr>
-      <w:tr>
-        <w:tc>
-          <w:tcPr/>
-          <w:p>
-            <w:pPr>
-              <w:pStyle w:val="Compact"/>
-            </w:pPr>
-            <w:r>
-              <w:t xml:space="preserve">Transfer-to-review interval</w:t>
-            </w:r>
-          </w:p>
-        </w:tc>
-        <w:tc>
-          <w:tcPr/>
-          <w:p>
-            <w:pPr>
-              <w:pStyle w:val="Compact"/>
-            </w:pPr>
-            <w:r>
-              <w:t xml:space="preserve">Transfer effective date → residual-access review completion</w:t>
-            </w:r>
-          </w:p>
-        </w:tc>
-        <w:tc>
-          <w:tcPr/>
-          <w:p>
-            <w:pPr>
-              <w:pStyle w:val="Compact"/>
-            </w:pPr>
-            <w:r>
-              <w:t xml:space="preserve">PS-5’s initiate-within-time-period</w:t>
-            </w:r>
-          </w:p>
-        </w:tc>
-      </w:tr>
-      <w:tr>
-        <w:tc>
-          <w:tcPr/>
-          <w:p>
-            <w:pPr>
-              <w:pStyle w:val="Compact"/>
-            </w:pPr>
-            <w:r>
-              <w:t xml:space="preserve">Joiner readiness rate</w:t>
-            </w:r>
-          </w:p>
-        </w:tc>
-        <w:tc>
-          <w:tcPr/>
-          <w:p>
-            <w:pPr>
-              <w:pStyle w:val="Compact"/>
-            </w:pPr>
-            <w:r>
-              <w:t xml:space="preserve">Share of new hires whose account, licenses, and baseline access exist at start-of-day one</w:t>
-            </w:r>
-          </w:p>
-        </w:tc>
-        <w:tc>
-          <w:tcPr/>
-          <w:p>
-            <w:pPr>
-              <w:pStyle w:val="Compact"/>
-            </w:pPr>
-            <w:r>
-              <w:t xml:space="preserve">AC-2 lifecycle automation working in the creation direction</w:t>
-            </w:r>
-          </w:p>
-        </w:tc>
-      </w:tr>
-      <w:tr>
-        <w:tc>
-          <w:tcPr/>
-          <w:p>
-            <w:pPr>
-              <w:pStyle w:val="Compact"/>
-            </w:pPr>
-            <w:r>
-              <w:t xml:space="preserve">Correlation coverage</w:t>
-            </w:r>
-          </w:p>
-        </w:tc>
-        <w:tc>
-          <w:tcPr/>
-          <w:p>
-            <w:pPr>
-              <w:pStyle w:val="Compact"/>
-            </w:pPr>
-            <w:r>
-              <w:t xml:space="preserve">Share of enabled accounts resolvable to a current worker record</w:t>
-            </w:r>
-          </w:p>
-        </w:tc>
-        <w:tc>
-          <w:tcPr/>
-          <w:p>
-            <w:pPr>
-              <w:pStyle w:val="Compact"/>
-            </w:pPr>
-            <w:r>
-              <w:t xml:space="preserve">The orphan population, as a query instead of a hunt</w:t>
-            </w:r>
-          </w:p>
-        </w:tc>
-      </w:tr>
-      <w:tr>
-        <w:tc>
-          <w:tcPr/>
-          <w:p>
-            <w:pPr>
-              <w:pStyle w:val="Compact"/>
-            </w:pPr>
-            <w:r>
-              <w:t xml:space="preserve">Derivation purity</w:t>
-            </w:r>
-          </w:p>
-        </w:tc>
-        <w:tc>
-          <w:tcPr/>
-          <w:p>
-            <w:pPr>
-              <w:pStyle w:val="Compact"/>
-            </w:pPr>
-            <w:r>
-              <w:t xml:space="preserve">Share of group memberships computed by rule versus assigned by hand</w:t>
-            </w:r>
-          </w:p>
-        </w:tc>
-        <w:tc>
-          <w:tcPr/>
-          <w:p>
-            <w:pPr>
-              <w:pStyle w:val="Compact"/>
-            </w:pPr>
-            <w:r>
-              <w:t xml:space="preserve">How much of the estate still runs on fragments</w:t>
-            </w:r>
-          </w:p>
-        </w:tc>
-      </w:tr>
-    </w:tbl>
-    <w:p>
-      <w:pPr>
-        <w:pStyle w:val="BodyText"/>
-      </w:pPr>
-      <w:r>
-        <w:t xml:space="preserve">None of these numbers exists in a ticket-driven estate — not because nobody computes them, but because the events they measure are not recorded as events. The metric</w:t>
-      </w:r>
-      <w:r>
-        <w:t xml:space="preserve"> </w:t>
-      </w:r>
-      <w:r>
-        <w:rPr>
-          <w:i/>
-          <w:iCs/>
-        </w:rPr>
-        <w:t xml:space="preserve">is</w:t>
-      </w:r>
-      <w:r>
-        <w:t xml:space="preserve"> </w:t>
-      </w:r>
-      <w:r>
-        <w:t xml:space="preserve">the argument: an architecture that cannot measure its own revocation latency is asserting PS-4 compliance on faith.</w:t>
-      </w:r>
-    </w:p>
-    <w:bookmarkEnd w:id="54"/>
-    <w:bookmarkEnd w:id="55"/>
-    <w:bookmarkStart w:id="63" w:name="the-organizational-ssot"/>
-    <w:p>
-      <w:pPr>
-        <w:pStyle w:val="Heading1"/>
-      </w:pPr>
-      <w:r>
-        <w:t xml:space="preserve">5. The Organizational SSOT</w:t>
-      </w:r>
-    </w:p>
-    <w:bookmarkStart w:id="56" w:name="structure-as-queryable-truth"/>
-    <w:p>
-      <w:pPr>
-        <w:pStyle w:val="Heading2"/>
-      </w:pPr>
-      <w:r>
-        <w:t xml:space="preserve">5.1 Structure as Queryable Truth</w:t>
-      </w:r>
-    </w:p>
-    <w:p>
-      <w:pPr>
-        <w:pStyle w:val="FirstParagraph"/>
-      </w:pPr>
-      <w:r>
-        <w:t xml:space="preserve">The second half of this book’s title is the one estates habitually skip. Identity SSOT projects say</w:t>
-      </w:r>
-      <w:r>
-        <w:t xml:space="preserve"> </w:t>
-      </w:r>
-      <w:r>
-        <w:t xml:space="preserve">“HR drives accounts”</w:t>
-      </w:r>
-      <w:r>
-        <w:t xml:space="preserve"> </w:t>
-      </w:r>
-      <w:r>
-        <w:t xml:space="preserve">and stop — leaving</w:t>
-      </w:r>
-      <w:r>
-        <w:t xml:space="preserve"> </w:t>
-      </w:r>
-      <w:r>
-        <w:rPr>
-          <w:i/>
-          <w:iCs/>
-        </w:rPr>
-        <w:t xml:space="preserve">organizational</w:t>
-      </w:r>
-      <w:r>
-        <w:t xml:space="preserve"> </w:t>
-      </w:r>
-      <w:r>
-        <w:t xml:space="preserve">truth (who reports to whom, which positions exist, which cost center pays) in the OU paths and the Visio files. The result is an identity plane that knows who exists but not where they sit, which forces every access decision back onto hand-maintained groups — and hand-maintained groups are per-system account stores wearing a nicer name.</w:t>
-      </w:r>
-    </w:p>
-    <w:p>
-      <w:pPr>
-        <w:pStyle w:val="BodyText"/>
-      </w:pPr>
-      <w:r>
-        <w:t xml:space="preserve">The organizational SSOT makes three record families queryable:</w:t>
-      </w:r>
-    </w:p>
-    <w:p>
-      <w:pPr>
-        <w:pStyle w:val="Compact"/>
-        <w:numPr>
-          <w:ilvl w:val="0"/>
-          <w:numId w:val="1007"/>
-        </w:numPr>
-      </w:pPr>
-      <w:r>
-        <w:rPr>
-          <w:b/>
-          <w:bCs/>
-        </w:rPr>
-        <w:t xml:space="preserve">Supervisory organization.</w:t>
-      </w:r>
-      <w:r>
-        <w:t xml:space="preserve"> </w:t>
-      </w:r>
-      <w:r>
-        <w:t xml:space="preserve">The reporting hierarchy as effective-dated records: any worker’s chain of command, resolvable by API at decision time. This is the fact that access-package approvals, attestation campaigns, and separation-of-duties checks all silently depend on — and today mostly fake with a stale directory</w:t>
-      </w:r>
-      <w:r>
-        <w:t xml:space="preserve"> </w:t>
-      </w:r>
-      <w:r>
-        <w:rPr>
-          <w:rStyle w:val="VerbatimChar"/>
-        </w:rPr>
-        <w:t xml:space="preserve">manager</w:t>
-      </w:r>
-      <w:r>
-        <w:t xml:space="preserve"> </w:t>
-      </w:r>
-      <w:r>
-        <w:t xml:space="preserve">field.</w:t>
-      </w:r>
-    </w:p>
-    <w:p>
-      <w:pPr>
-        <w:pStyle w:val="Compact"/>
-        <w:numPr>
-          <w:ilvl w:val="0"/>
-          <w:numId w:val="1007"/>
-        </w:numPr>
-      </w:pPr>
-      <w:r>
-        <w:rPr>
-          <w:b/>
-          <w:bCs/>
-        </w:rPr>
-        <w:t xml:space="preserve">Position management.</w:t>
-      </w:r>
-      <w:r>
-        <w:t xml:space="preserve"> </w:t>
-      </w:r>
-      <w:r>
-        <w:t xml:space="preserve">Positions as records independent of incumbents. Access eligibility attaches to the</w:t>
-      </w:r>
-      <w:r>
-        <w:t xml:space="preserve"> </w:t>
-      </w:r>
-      <w:r>
-        <w:rPr>
-          <w:i/>
-          <w:iCs/>
-        </w:rPr>
-        <w:t xml:space="preserve">position</w:t>
-      </w:r>
-      <w:r>
-        <w:t xml:space="preserve"> </w:t>
-      </w:r>
-      <w:r>
-        <w:t xml:space="preserve">(</w:t>
-      </w:r>
-      <w:r>
-        <w:t xml:space="preserve">“this seat is entitled to the case-processing system”</w:t>
-      </w:r>
-      <w:r>
-        <w:t xml:space="preserve">), so a vacancy holds no access, an incumbent inherits the seat’s baseline on assignment, and a mover sheds it on reassignment — automatically, because the assignment is the membership rule’s input.</w:t>
-      </w:r>
-    </w:p>
-    <w:p>
-      <w:pPr>
-        <w:pStyle w:val="Compact"/>
-        <w:numPr>
-          <w:ilvl w:val="0"/>
-          <w:numId w:val="1007"/>
-        </w:numPr>
-      </w:pPr>
-      <w:r>
-        <w:rPr>
-          <w:b/>
-          <w:bCs/>
-        </w:rPr>
-        <w:t xml:space="preserve">Cost centers.</w:t>
-      </w:r>
-      <w:r>
-        <w:t xml:space="preserve"> </w:t>
-      </w:r>
-      <w:r>
-        <w:t xml:space="preserve">The financial dimension of placement, driving license chargeback and scoping the blast radius of any entitlement to the organizational unit that owns it.</w:t>
-      </w:r>
-    </w:p>
-    <w:p>
-      <w:pPr>
-        <w:pStyle w:val="FirstParagraph"/>
-      </w:pPr>
-      <w:hyperlink r:id="rId18">
-        <w:r>
-          <w:rPr>
-            <w:rStyle w:val="Hyperlink"/>
-          </w:rPr>
-          <w:t xml:space="preserve">Book 05</w:t>
-        </w:r>
-      </w:hyperlink>
-      <w:r>
-        <w:t xml:space="preserve">’s history explains why this matters at reorganization time. Under fragmented truth, a reorganization is a</w:t>
-      </w:r>
-      <w:r>
-        <w:t xml:space="preserve"> </w:t>
-      </w:r>
-      <w:r>
-        <w:rPr>
-          <w:i/>
-          <w:iCs/>
-        </w:rPr>
-        <w:t xml:space="preserve">migration project</w:t>
-      </w:r>
-      <w:r>
-        <w:t xml:space="preserve">: OU restructuring, group renames, GPO re-links, months of drift. Under the organizational SSOT, a reorganization is a</w:t>
-      </w:r>
-      <w:r>
-        <w:t xml:space="preserve"> </w:t>
-      </w:r>
-      <w:r>
-        <w:rPr>
-          <w:i/>
-          <w:iCs/>
-        </w:rPr>
-        <w:t xml:space="preserve">data change</w:t>
-      </w:r>
-      <w:r>
-        <w:t xml:space="preserve"> </w:t>
-      </w:r>
-      <w:r>
-        <w:t xml:space="preserve">— the HR records change, the attributes re-stamp, the memberships recompute — and the doctrinal corollary follows: a drifted OU estate is</w:t>
-      </w:r>
-      <w:r>
-        <w:t xml:space="preserve"> </w:t>
-      </w:r>
-      <w:r>
-        <w:rPr>
-          <w:b/>
-          <w:bCs/>
-        </w:rPr>
-        <w:t xml:space="preserve">overlaid and retired, not remediated</w:t>
-      </w:r>
-      <w:r>
-        <w:t xml:space="preserve">. Rebuilding OU trees to match reality is expensive, high-risk, and pointless once no policy reads OU position; the truth is stamped as attributes, policy re-bases onto attribute-driven groups, and the residual OU bindings are inventoried and decommissioned deliberately.</w:t>
-      </w:r>
-    </w:p>
-    <w:bookmarkEnd w:id="56"/>
-    <w:bookmarkStart w:id="57" w:name="X1c44efed6f59a195bc8d7df37c3cec34f95e174"/>
-    <w:p>
-      <w:pPr>
-        <w:pStyle w:val="Heading2"/>
-      </w:pPr>
-      <w:r>
-        <w:t xml:space="preserve">5.2 From HR Attributes to Access: The Derivation Chain</w:t>
-      </w:r>
-    </w:p>
-    <w:p>
-      <w:pPr>
-        <w:pStyle w:val="FirstParagraph"/>
-      </w:pPr>
-      <w:r>
-        <w:t xml:space="preserve">The organizational SSOT earns its keep through one repeatable chain:</w:t>
-      </w:r>
-    </w:p>
-    <w:p>
-      <w:pPr>
-        <w:pStyle w:val="BodyText"/>
-      </w:pPr>
-      <w:r>
-        <w:rPr>
-          <w:b/>
-          <w:bCs/>
-        </w:rPr>
-        <w:t xml:space="preserve">Worker record → stamped attributes → dynamic groups → entitlements.</w:t>
-      </w:r>
-    </w:p>
-    <w:p>
-      <w:pPr>
-        <w:pStyle w:val="BodyText"/>
-      </w:pPr>
-      <w:r>
-        <w:t xml:space="preserve">Dynamic groups are membership</w:t>
-      </w:r>
-      <w:r>
-        <w:t xml:space="preserve"> </w:t>
-      </w:r>
-      <w:r>
-        <w:rPr>
-          <w:i/>
-          <w:iCs/>
-        </w:rPr>
-        <w:t xml:space="preserve">rules</w:t>
-      </w:r>
-      <w:r>
-        <w:t xml:space="preserve"> </w:t>
-      </w:r>
-      <w:r>
-        <w:t xml:space="preserve">over HR-derived attributes (</w:t>
-      </w:r>
-      <w:r>
-        <w:t xml:space="preserve">“all workers whose org code is under X and worker type is employee”</w:t>
-      </w:r>
-      <w:r>
-        <w:t xml:space="preserve">), evaluated continuously by the identity platform. Access packages bundle entitlements behind eligibility rules and approval flows that route to the supervisor</w:t>
-      </w:r>
-      <w:r>
-        <w:t xml:space="preserve"> </w:t>
-      </w:r>
-      <w:r>
-        <w:rPr>
-          <w:i/>
-          <w:iCs/>
-        </w:rPr>
-        <w:t xml:space="preserve">of record</w:t>
-      </w:r>
-      <w:r>
-        <w:t xml:space="preserve">. Conditional access and application roles consume the same attributes as ABAC inputs, and role assignments — RBAC — are granted through the packages rather than by direct assignment. The properties that follow:</w:t>
-      </w:r>
-    </w:p>
-    <w:p>
-      <w:pPr>
-        <w:pStyle w:val="Compact"/>
-        <w:numPr>
-          <w:ilvl w:val="0"/>
-          <w:numId w:val="1008"/>
-        </w:numPr>
-      </w:pPr>
-      <w:r>
-        <w:rPr>
-          <w:b/>
-          <w:bCs/>
-        </w:rPr>
-        <w:t xml:space="preserve">Nobody joins these groups; membership is computed.</w:t>
-      </w:r>
-      <w:r>
-        <w:t xml:space="preserve"> </w:t>
-      </w:r>
-      <w:r>
-        <w:t xml:space="preserve">There is no group owner to lobby, no ticket to lose, no offboarding step to forget. The mover’s access converges on the new assignment’s derivation within the provisioning cycle.</w:t>
-      </w:r>
-    </w:p>
-    <w:p>
-      <w:pPr>
-        <w:pStyle w:val="Compact"/>
-        <w:numPr>
-          <w:ilvl w:val="0"/>
-          <w:numId w:val="1008"/>
-        </w:numPr>
-      </w:pPr>
-      <w:r>
-        <w:rPr>
-          <w:b/>
-          <w:bCs/>
-        </w:rPr>
-        <w:t xml:space="preserve">Every entitlement has a</w:t>
-      </w:r>
-      <w:r>
-        <w:rPr>
-          <w:b/>
-          <w:bCs/>
-        </w:rPr>
-        <w:t xml:space="preserve"> </w:t>
-      </w:r>
-      <w:r>
-        <w:rPr>
-          <w:b/>
-          <w:bCs/>
-          <w:i/>
-          <w:iCs/>
-        </w:rPr>
-        <w:t xml:space="preserve">because</w:t>
-      </w:r>
-      <w:r>
-        <w:rPr>
-          <w:b/>
-          <w:bCs/>
-        </w:rPr>
-        <w:t xml:space="preserve">.</w:t>
-      </w:r>
-      <w:r>
-        <w:t xml:space="preserve"> </w:t>
-      </w:r>
-      <w:r>
-        <w:t xml:space="preserve">Access exists because an attribute satisfied a rule; the attribute exists because an HR record asserted it; the record has an author, a date, and a business act behind it. That chain</w:t>
-      </w:r>
-      <w:r>
-        <w:t xml:space="preserve"> </w:t>
-      </w:r>
-      <w:r>
-        <w:rPr>
-          <w:i/>
-          <w:iCs/>
-        </w:rPr>
-        <w:t xml:space="preserve">is</w:t>
-      </w:r>
-      <w:r>
-        <w:t xml:space="preserve"> </w:t>
-      </w:r>
-      <w:r>
-        <w:t xml:space="preserve">the access authorization data AC-2 wants, and it is queryable end to end.</w:t>
-      </w:r>
-    </w:p>
-    <w:p>
-      <w:pPr>
-        <w:pStyle w:val="Compact"/>
-        <w:numPr>
-          <w:ilvl w:val="0"/>
-          <w:numId w:val="1008"/>
-        </w:numPr>
-      </w:pPr>
-      <w:r>
-        <w:rPr>
-          <w:b/>
-          <w:bCs/>
-        </w:rPr>
-        <w:t xml:space="preserve">ABAC and RBAC stop being rival religions.</w:t>
-      </w:r>
-      <w:r>
-        <w:t xml:space="preserve"> </w:t>
-      </w:r>
-      <w:r>
-        <w:t xml:space="preserve">Roles define what a position may touch; attributes prove which position the person holds. Both resolve against the same upstream truth, which is the only arrangement in which they cannot disagree.</w:t>
-      </w:r>
-    </w:p>
-    <w:bookmarkEnd w:id="57"/>
-    <w:bookmarkStart w:id="62" w:name="attestation-lands-on-the-same-rail"/>
-    <w:p>
-      <w:pPr>
-        <w:pStyle w:val="Heading2"/>
-      </w:pPr>
-      <w:r>
-        <w:t xml:space="preserve">5.3 Attestation Lands on the Same Rail</w:t>
-      </w:r>
-    </w:p>
-    <w:p>
-      <w:pPr>
-        <w:pStyle w:val="FirstParagraph"/>
-      </w:pPr>
-      <w:r>
-        <w:t xml:space="preserve">The access reviews this book declined to accept as a</w:t>
-      </w:r>
-      <w:r>
-        <w:t xml:space="preserve"> </w:t>
-      </w:r>
-      <w:r>
-        <w:rPr>
-          <w:i/>
-          <w:iCs/>
-        </w:rPr>
-        <w:t xml:space="preserve">source</w:t>
-      </w:r>
-      <w:r>
-        <w:t xml:space="preserve"> </w:t>
-      </w:r>
-      <w:r>
-        <w:t xml:space="preserve">of truth return here as a sharpened</w:t>
-      </w:r>
-      <w:r>
-        <w:t xml:space="preserve"> </w:t>
-      </w:r>
-      <w:r>
-        <w:rPr>
-          <w:i/>
-          <w:iCs/>
-        </w:rPr>
-        <w:t xml:space="preserve">verification</w:t>
-      </w:r>
-      <w:r>
-        <w:t xml:space="preserve"> </w:t>
-      </w:r>
-      <w:r>
-        <w:t xml:space="preserve">of it. Once entitlements derive from the organizational SSOT, AC-2(j)’s periodic review stops being a spreadsheet mailed to whoever a stale directory field names, and becomes a campaign the org SSOT itself scopes and routes:</w:t>
-      </w:r>
-    </w:p>
-    <w:p>
-      <w:pPr>
-        <w:pStyle w:val="Compact"/>
-        <w:numPr>
-          <w:ilvl w:val="0"/>
-          <w:numId w:val="1009"/>
-        </w:numPr>
-      </w:pPr>
-      <w:r>
-        <w:rPr>
-          <w:b/>
-          <w:bCs/>
-        </w:rPr>
-        <w:t xml:space="preserve">The reviewer is the supervisor of record</w:t>
-      </w:r>
-      <w:r>
-        <w:t xml:space="preserve"> </w:t>
-      </w:r>
-      <w:r>
-        <w:t xml:space="preserve">— resolved from the reporting hierarchy at campaign launch, not from a</w:t>
-      </w:r>
-      <w:r>
-        <w:t xml:space="preserve"> </w:t>
-      </w:r>
-      <w:r>
-        <w:rPr>
-          <w:rStyle w:val="VerbatimChar"/>
-        </w:rPr>
-        <w:t xml:space="preserve">manager</w:t>
-      </w:r>
-      <w:r>
-        <w:t xml:space="preserve"> </w:t>
-      </w:r>
-      <w:r>
-        <w:t xml:space="preserve">field last edited during a previous administration.</w:t>
-      </w:r>
-    </w:p>
-    <w:p>
-      <w:pPr>
-        <w:pStyle w:val="Compact"/>
-        <w:numPr>
-          <w:ilvl w:val="0"/>
-          <w:numId w:val="1009"/>
-        </w:numPr>
-      </w:pPr>
-      <w:r>
-        <w:rPr>
-          <w:b/>
-          <w:bCs/>
-        </w:rPr>
-        <w:t xml:space="preserve">The review population is attribute-scoped</w:t>
-      </w:r>
-      <w:r>
-        <w:t xml:space="preserve"> </w:t>
-      </w:r>
-      <w:r>
-        <w:t xml:space="preserve">—</w:t>
-      </w:r>
-      <w:r>
-        <w:t xml:space="preserve"> </w:t>
-      </w:r>
-      <w:r>
-        <w:t xml:space="preserve">“all workers in this organization with access outside its derivation baseline”</w:t>
-      </w:r>
-      <w:r>
-        <w:t xml:space="preserve"> </w:t>
-      </w:r>
-      <w:r>
-        <w:t xml:space="preserve">is a query, so reviewers see the</w:t>
-      </w:r>
-      <w:r>
-        <w:t xml:space="preserve"> </w:t>
-      </w:r>
-      <w:r>
-        <w:rPr>
-          <w:i/>
-          <w:iCs/>
-        </w:rPr>
-        <w:t xml:space="preserve">exceptions</w:t>
-      </w:r>
-      <w:r>
-        <w:t xml:space="preserve"> </w:t>
-      </w:r>
-      <w:r>
-        <w:t xml:space="preserve">rather than four hundred rubber-stampable rows.</w:t>
-      </w:r>
-    </w:p>
-    <w:p>
-      <w:pPr>
-        <w:pStyle w:val="Compact"/>
-        <w:numPr>
-          <w:ilvl w:val="0"/>
-          <w:numId w:val="1009"/>
-        </w:numPr>
-      </w:pPr>
-      <w:r>
-        <w:rPr>
-          <w:b/>
-          <w:bCs/>
-        </w:rPr>
-        <w:t xml:space="preserve">The review outcome is a record correction</w:t>
-      </w:r>
-      <w:r>
-        <w:t xml:space="preserve"> </w:t>
-      </w:r>
-      <w:r>
-        <w:t xml:space="preserve">— a rejected entitlement is removed by fixing the attribute, the rule, or the exception entry that produced it, so the same wrong answer cannot regrow from the same wrong input.</w:t>
-      </w:r>
-    </w:p>
-    <w:p>
-      <w:pPr>
-        <w:pStyle w:val="FirstParagraph"/>
-      </w:pPr>
-      <w:r>
-        <w:t xml:space="preserve">The separation-of-duties checks of later parts read the same rails: conflicting-role detection needs to know that two roles are held by the same</w:t>
-      </w:r>
-      <w:r>
-        <w:t xml:space="preserve"> </w:t>
-      </w:r>
-      <w:r>
-        <w:rPr>
-          <w:i/>
-          <w:iCs/>
-        </w:rPr>
-        <w:t xml:space="preserve">person</w:t>
-      </w:r>
-      <w:r>
-        <w:t xml:space="preserve"> </w:t>
-      </w:r>
-      <w:r>
-        <w:t xml:space="preserve">(the IA-4 anchor) and whether an approver</w:t>
-      </w:r>
-      <w:r>
-        <w:t xml:space="preserve"> </w:t>
-      </w:r>
-      <w:r>
-        <w:rPr>
-          <w:i/>
-          <w:iCs/>
-        </w:rPr>
-        <w:t xml:space="preserve">reports to</w:t>
-      </w:r>
-      <w:r>
-        <w:t xml:space="preserve"> </w:t>
-      </w:r>
-      <w:r>
-        <w:t xml:space="preserve">the requester (the supervisory org). Both facts are queries against this book’s records; neither is answerable from a directory that tracks accounts and drawings that track boxes.</w:t>
       </w:r>
     </w:p>
     <w:tbl>
@@ -5689,7 +4447,7 @@
       <w:tr>
         <w:tc>
           <w:tcPr/>
-          <w:bookmarkStart w:id="61" w:name="fig-hrit04"/>
+          <w:bookmarkStart w:id="53" w:name="fig-hrit06"/>
           <w:p>
             <w:pPr>
               <w:pStyle w:val="Compact"/>
@@ -5700,18 +4458,18 @@
                 <wp:inline>
                   <wp:extent cx="5334000" cy="3000375"/>
                   <wp:effectExtent b="0" l="0" r="0" t="0"/>
-                  <wp:docPr descr="" title="" id="59" name="Picture"/>
+                  <wp:docPr descr="" title="" id="51" name="Picture"/>
                   <a:graphic>
                     <a:graphicData uri="http://schemas.openxmlformats.org/drawingml/2006/picture">
                       <pic:pic>
                         <pic:nvPicPr>
-                          <pic:cNvPr descr="figs/hrit-fig-04-org-ssot-derivation.png" id="60" name="Picture"/>
+                          <pic:cNvPr descr="figs/hrit-fig-06-provisioning-pipeline.png" id="52" name="Picture"/>
                           <pic:cNvPicPr>
                             <a:picLocks noChangeArrowheads="1" noChangeAspect="1"/>
                           </pic:cNvPicPr>
                         </pic:nvPicPr>
                         <pic:blipFill>
-                          <a:blip r:embed="rId58"/>
+                          <a:blip r:embed="rId50"/>
                           <a:stretch>
                             <a:fillRect/>
                           </a:stretch>
@@ -5748,16 +4506,1437 @@
               <w:pStyle w:val="ImageCaption"/>
             </w:pPr>
             <w:r>
-              <w:t xml:space="preserve">Figure 4: The organizational SSOT derivation chain from HR record to entitlement</w:t>
-            </w:r>
-          </w:p>
-          <w:bookmarkEnd w:id="61"/>
+              <w:t xml:space="preserve">Figure 4: The inbound provisioning pipeline — one entry point, one provenance stream</w:t>
+            </w:r>
+          </w:p>
+          <w:bookmarkEnd w:id="53"/>
         </w:tc>
       </w:tr>
     </w:tbl>
+    <w:bookmarkEnd w:id="54"/>
+    <w:bookmarkStart w:id="55" w:name="one-person-one-identifier"/>
+    <w:p>
+      <w:pPr>
+        <w:pStyle w:val="Heading2"/>
+      </w:pPr>
+      <w:r>
+        <w:t xml:space="preserve">4.3 One Person, One Identifier</w:t>
+      </w:r>
+    </w:p>
+    <w:p>
+      <w:pPr>
+        <w:pStyle w:val="FirstParagraph"/>
+      </w:pPr>
+      <w:r>
+        <w:t xml:space="preserve">IA-4 requires managing identifiers by receiving authorization to assign them, selecting and assigning them to the intended entity, and</w:t>
+      </w:r>
+      <w:r>
+        <w:t xml:space="preserve"> </w:t>
+      </w:r>
+      <w:r>
+        <w:rPr>
+          <w:b/>
+          <w:bCs/>
+        </w:rPr>
+        <w:t xml:space="preserve">preventing their reuse</w:t>
+      </w:r>
+      <w:r>
+        <w:t xml:space="preserve"> </w:t>
+      </w:r>
+      <w:r>
+        <w:t xml:space="preserve">for a defined period. The enterprise discipline this architecture implements is stricter and simpler:</w:t>
+      </w:r>
+      <w:r>
+        <w:t xml:space="preserve"> </w:t>
+      </w:r>
+      <w:r>
+        <w:rPr>
+          <w:b/>
+          <w:bCs/>
+        </w:rPr>
+        <w:t xml:space="preserve">one person, one identifier, for the life of the affiliation — across every account, system, rehire, and conversion.</w:t>
+      </w:r>
+    </w:p>
+    <w:p>
+      <w:pPr>
+        <w:pStyle w:val="BodyText"/>
+      </w:pPr>
+      <w:r>
+        <w:t xml:space="preserve">The</w:t>
+      </w:r>
+      <w:r>
+        <w:t xml:space="preserve"> </w:t>
+      </w:r>
+      <w:r>
+        <w:rPr>
+          <w:rStyle w:val="VerbatimChar"/>
+        </w:rPr>
+        <w:t xml:space="preserve">employeeId</w:t>
+      </w:r>
+      <w:r>
+        <w:t xml:space="preserve"> </w:t>
+      </w:r>
+      <w:r>
+        <w:t xml:space="preserve">assigned at first affiliation is the immutable correlation anchor. It never changes with name, position, region, or worker type; every account in every system that belongs to the person carries it; and when the person returns after a break in service, the rehire event re-links the</w:t>
+      </w:r>
+      <w:r>
+        <w:t xml:space="preserve"> </w:t>
+      </w:r>
+      <w:r>
+        <w:rPr>
+          <w:i/>
+          <w:iCs/>
+        </w:rPr>
+        <w:t xml:space="preserve">same</w:t>
+      </w:r>
+      <w:r>
+        <w:t xml:space="preserve"> </w:t>
+      </w:r>
+      <w:r>
+        <w:t xml:space="preserve">identifier rather than minting a fresh identity. This is only possible where the</w:t>
+      </w:r>
+      <w:r>
+        <w:t xml:space="preserve"> </w:t>
+      </w:r>
+      <w:r>
+        <w:rPr>
+          <w:i/>
+          <w:iCs/>
+        </w:rPr>
+        <w:t xml:space="preserve">person</w:t>
+      </w:r>
+      <w:r>
+        <w:t xml:space="preserve"> </w:t>
+      </w:r>
+      <w:r>
+        <w:t xml:space="preserve">— not the account — is the tracked entity. A directory cannot do it: directories track accounts, and an account deleted at separation takes its history with it. The worker record persists across affiliations, which is why identifier non-reuse and rehire correlation are properties of the HR plane, projected downward.</w:t>
+      </w:r>
+    </w:p>
+    <w:p>
+      <w:pPr>
+        <w:pStyle w:val="BodyText"/>
+      </w:pPr>
+      <w:r>
+        <w:t xml:space="preserve">The same anchor is what makes audit joins possible at all: the token event in the SIEM, the database login, the badge swipe, and the personnel action resolve to one person only because one identifier threads them.</w:t>
+      </w:r>
+    </w:p>
+    <w:bookmarkEnd w:id="55"/>
+    <w:bookmarkStart w:id="56" w:name="the-worker-type-boundary"/>
+    <w:p>
+      <w:pPr>
+        <w:pStyle w:val="Heading2"/>
+      </w:pPr>
+      <w:r>
+        <w:t xml:space="preserve">4.4 The Worker-Type Boundary</w:t>
+      </w:r>
+    </w:p>
+    <w:p>
+      <w:pPr>
+        <w:pStyle w:val="FirstParagraph"/>
+      </w:pPr>
+      <w:r>
+        <w:t xml:space="preserve">One authoritative attribute deserves special notice because entire policy families hang from it:</w:t>
+      </w:r>
+      <w:r>
+        <w:t xml:space="preserve"> </w:t>
+      </w:r>
+      <w:r>
+        <w:rPr>
+          <w:b/>
+          <w:bCs/>
+        </w:rPr>
+        <w:t xml:space="preserve">worker type.</w:t>
+      </w:r>
+      <w:r>
+        <w:t xml:space="preserve"> </w:t>
+      </w:r>
+      <w:r>
+        <w:t xml:space="preserve">Employee, contractor, intern, volunteer — the classification determines member-versus-guest treatment in the tenant, license assignment, access ceilings, and which conditional-access baseline applies. When worker type is a directory field someone sets at account creation, it is wrong exactly as often as staffing paperwork is ambiguous, and the errors are invisible because nothing reconciles them. When it is derived from the worker record, the contractor whose engagement ends loses access on the engagement’s end date (a leaver event for a non-employee), and the conversion seam — contractor on Friday, employee on Monday — is a re-derivation on the same identifier rather than a second identity with a second, forgotten first account. IA-4(4)’s status characterization (identifying each individual as, for example, a contractor) falls out of the same attribute for free: the characteristic is asserted by the system that classifies workers as a business act, not annotated by an administrator who heard about it.</w:t>
+      </w:r>
+    </w:p>
+    <w:bookmarkEnd w:id="56"/>
+    <w:bookmarkStart w:id="61" w:name="X6425fd18b5c4f116f10f22295a2c67df893cf44"/>
+    <w:p>
+      <w:pPr>
+        <w:pStyle w:val="Heading2"/>
+      </w:pPr>
+      <w:r>
+        <w:t xml:space="preserve">4.5 Deprovisioning Is an HR Event, Not a Ticket</w:t>
+      </w:r>
+    </w:p>
+    <w:p>
+      <w:pPr>
+        <w:pStyle w:val="FirstParagraph"/>
+      </w:pPr>
+      <w:r>
+        <w:t xml:space="preserve">The leaver sequence deserves its own statement, because it is where the fragmented-truth architecture kills its audit findings — and occasionally its incident reports. In the target state, separation processing is initiated by the effective-dated termination record, and the automated sequence executes on that date, in order, as one workflow:</w:t>
+      </w:r>
+    </w:p>
+    <w:p>
+      <w:pPr>
+        <w:pStyle w:val="Compact"/>
+        <w:numPr>
+          <w:ilvl w:val="0"/>
+          <w:numId w:val="1006"/>
+        </w:numPr>
+      </w:pPr>
+      <w:r>
+        <w:rPr>
+          <w:b/>
+          <w:bCs/>
+        </w:rPr>
+        <w:t xml:space="preserve">Disable the account</w:t>
+      </w:r>
+      <w:r>
+        <w:t xml:space="preserve"> </w:t>
+      </w:r>
+      <w:r>
+        <w:t xml:space="preserve">— the sign-in gate closes first.</w:t>
+      </w:r>
+    </w:p>
+    <w:p>
+      <w:pPr>
+        <w:pStyle w:val="Compact"/>
+        <w:numPr>
+          <w:ilvl w:val="0"/>
+          <w:numId w:val="1006"/>
+        </w:numPr>
+      </w:pPr>
+      <w:r>
+        <w:rPr>
+          <w:b/>
+          <w:bCs/>
+        </w:rPr>
+        <w:t xml:space="preserve">Revoke active sessions and refresh tokens</w:t>
+      </w:r>
+      <w:r>
+        <w:t xml:space="preserve"> </w:t>
+      </w:r>
+      <w:r>
+        <w:t xml:space="preserve">— disabling prevents</w:t>
+      </w:r>
+      <w:r>
+        <w:t xml:space="preserve"> </w:t>
+      </w:r>
+      <w:r>
+        <w:rPr>
+          <w:i/>
+          <w:iCs/>
+        </w:rPr>
+        <w:t xml:space="preserve">new</w:t>
+      </w:r>
+      <w:r>
+        <w:t xml:space="preserve"> </w:t>
+      </w:r>
+      <w:r>
+        <w:t xml:space="preserve">tokens; revocation ends the ones already issued, so the control takes effect in token-lifetime minutes rather than at next sign-in.</w:t>
+      </w:r>
+    </w:p>
+    <w:p>
+      <w:pPr>
+        <w:pStyle w:val="Compact"/>
+        <w:numPr>
+          <w:ilvl w:val="0"/>
+          <w:numId w:val="1006"/>
+        </w:numPr>
+      </w:pPr>
+      <w:r>
+        <w:rPr>
+          <w:b/>
+          <w:bCs/>
+        </w:rPr>
+        <w:t xml:space="preserve">Verify</w:t>
+      </w:r>
+      <w:r>
+        <w:t xml:space="preserve"> </w:t>
+      </w:r>
+      <w:r>
+        <w:t xml:space="preserve">— read back the revocation state; a step that cannot be confirmed is a step that did not happen, as far as evidence is concerned.</w:t>
+      </w:r>
+    </w:p>
+    <w:p>
+      <w:pPr>
+        <w:pStyle w:val="Compact"/>
+        <w:numPr>
+          <w:ilvl w:val="0"/>
+          <w:numId w:val="1006"/>
+        </w:numPr>
+      </w:pPr>
+      <w:r>
+        <w:rPr>
+          <w:b/>
+          <w:bCs/>
+        </w:rPr>
+        <w:t xml:space="preserve">Remove group memberships and access-package assignments</w:t>
+      </w:r>
+      <w:r>
+        <w:t xml:space="preserve"> </w:t>
+      </w:r>
+      <w:r>
+        <w:t xml:space="preserve">— entitlements end even where a downstream application caches identity.</w:t>
+      </w:r>
+    </w:p>
+    <w:p>
+      <w:pPr>
+        <w:pStyle w:val="Compact"/>
+        <w:numPr>
+          <w:ilvl w:val="0"/>
+          <w:numId w:val="1006"/>
+        </w:numPr>
+      </w:pPr>
+      <w:r>
+        <w:rPr>
+          <w:b/>
+          <w:bCs/>
+        </w:rPr>
+        <w:t xml:space="preserve">Revoke credentials</w:t>
+      </w:r>
+      <w:r>
+        <w:t xml:space="preserve"> </w:t>
+      </w:r>
+      <w:r>
+        <w:t xml:space="preserve">— certificates through the Book 03 lifecycle; the device’s admission credential through the Book 02 pipeline, so the port stops trusting the hardware too.</w:t>
+      </w:r>
+    </w:p>
+    <w:p>
+      <w:pPr>
+        <w:pStyle w:val="Compact"/>
+        <w:numPr>
+          <w:ilvl w:val="0"/>
+          <w:numId w:val="1006"/>
+        </w:numPr>
+      </w:pPr>
+      <w:r>
+        <w:rPr>
+          <w:b/>
+          <w:bCs/>
+        </w:rPr>
+        <w:t xml:space="preserve">Disposition data</w:t>
+      </w:r>
+      <w:r>
+        <w:t xml:space="preserve"> </w:t>
+      </w:r>
+      <w:r>
+        <w:t xml:space="preserve">— mailbox archive or conversion, file ownership transfer, retention and litigation-hold exceptions applied per policy rather than per memory.</w:t>
+      </w:r>
+    </w:p>
+    <w:p>
+      <w:pPr>
+        <w:pStyle w:val="FirstParagraph"/>
+      </w:pPr>
+      <w:r>
+        <w:t xml:space="preserve">Each step emits a timestamped evidence record; the</w:t>
+      </w:r>
+      <w:r>
+        <w:t xml:space="preserve"> </w:t>
+      </w:r>
+      <w:r>
+        <w:rPr>
+          <w:i/>
+          <w:iCs/>
+        </w:rPr>
+        <w:t xml:space="preserve">distance between the HR effective date and the last revocation timestamp</w:t>
+      </w:r>
+      <w:r>
+        <w:t xml:space="preserve"> </w:t>
+      </w:r>
+      <w:r>
+        <w:t xml:space="preserve">becomes a measured, reportable ConMon metric instead of an unknowable. Emergency terminations take a defined manual entry into the</w:t>
+      </w:r>
+      <w:r>
+        <w:t xml:space="preserve"> </w:t>
+      </w:r>
+      <w:r>
+        <w:rPr>
+          <w:i/>
+          <w:iCs/>
+        </w:rPr>
+        <w:t xml:space="preserve">same</w:t>
+      </w:r>
+      <w:r>
+        <w:t xml:space="preserve"> </w:t>
+      </w:r>
+      <w:r>
+        <w:t xml:space="preserve">sequence — the trigger is human, the execution and the evidence are identical.</w:t>
+      </w:r>
+    </w:p>
+    <w:tbl>
+      <w:tblPr>
+        <w:tblStyle w:val="Table"/>
+        <w:tblW w:type="pct" w:w="5000"/>
+        <w:tblLayout w:type="fixed"/>
+        <w:tblLook w:firstRow="0" w:lastRow="0" w:firstColumn="0" w:lastColumn="0" w:noHBand="0" w:noVBand="0" w:val="0000"/>
+      </w:tblPr>
+      <w:tblGrid>
+        <w:gridCol w:w="7920"/>
+      </w:tblGrid>
+      <w:tr>
+        <w:tc>
+          <w:tcPr/>
+          <w:bookmarkStart w:id="60" w:name="fig-hrit05"/>
+          <w:p>
+            <w:pPr>
+              <w:pStyle w:val="Compact"/>
+              <w:jc w:val="center"/>
+            </w:pPr>
+            <w:r>
+              <w:drawing>
+                <wp:inline>
+                  <wp:extent cx="5334000" cy="3000375"/>
+                  <wp:effectExtent b="0" l="0" r="0" t="0"/>
+                  <wp:docPr descr="" title="" id="58" name="Picture"/>
+                  <a:graphic>
+                    <a:graphicData uri="http://schemas.openxmlformats.org/drawingml/2006/picture">
+                      <pic:pic>
+                        <pic:nvPicPr>
+                          <pic:cNvPr descr="figs/hrit-fig-05-leaver-sequence.png" id="59" name="Picture"/>
+                          <pic:cNvPicPr>
+                            <a:picLocks noChangeArrowheads="1" noChangeAspect="1"/>
+                          </pic:cNvPicPr>
+                        </pic:nvPicPr>
+                        <pic:blipFill>
+                          <a:blip r:embed="rId57"/>
+                          <a:stretch>
+                            <a:fillRect/>
+                          </a:stretch>
+                        </pic:blipFill>
+                        <pic:spPr bwMode="auto">
+                          <a:xfrm>
+                            <a:off x="0" y="0"/>
+                            <a:ext cx="5334000" cy="3000375"/>
+                          </a:xfrm>
+                          <a:prstGeom prst="rect">
+                            <a:avLst/>
+                          </a:prstGeom>
+                          <a:noFill/>
+                          <a:ln w="9525">
+                            <a:noFill/>
+                            <a:headEnd/>
+                            <a:tailEnd/>
+                          </a:ln>
+                        </pic:spPr>
+                      </pic:pic>
+                    </a:graphicData>
+                  </a:graphic>
+                </wp:inline>
+              </w:drawing>
+            </w:r>
+          </w:p>
+          <w:p>
+            <w:pPr>
+              <w:jc w:val="center"/>
+            </w:pPr>
+            <w:pPr>
+              <w:jc w:val="left"/>
+              <w:spacing w:before="200"/>
+              <w:pStyle w:val="ImageCaption"/>
+            </w:pPr>
+            <w:r>
+              <w:t xml:space="preserve">Figure 5: The six-step leaver sequence — executed on the effective date, evidenced per step</w:t>
+            </w:r>
+          </w:p>
+          <w:bookmarkEnd w:id="60"/>
+        </w:tc>
+      </w:tr>
+    </w:tbl>
+    <w:p>
+      <w:pPr>
+        <w:pStyle w:val="BodyText"/>
+      </w:pPr>
+      <w:r>
+        <w:t xml:space="preserve">Contrast the input signals available to any alternative mechanism. The network cannot see a termination — the leaver’s laptop authenticates on their last day exactly as it did the day before. The SIEM sees</w:t>
+      </w:r>
+      <w:r>
+        <w:t xml:space="preserve"> </w:t>
+      </w:r>
+      <w:r>
+        <w:rPr>
+          <w:i/>
+          <w:iCs/>
+        </w:rPr>
+        <w:t xml:space="preserve">absence of activity</w:t>
+      </w:r>
+      <w:r>
+        <w:t xml:space="preserve">, which is indistinguishable from leave. The quarterly access review discovers the account up to ninety days late. Only one system in the enterprise records the separation as a first-class fact with an effective date — and once it does, everything downstream is a subscription.</w:t>
+      </w:r>
+    </w:p>
+    <w:bookmarkEnd w:id="61"/>
+    <w:bookmarkStart w:id="62" w:name="the-measured-lifecycle"/>
+    <w:p>
+      <w:pPr>
+        <w:pStyle w:val="Heading2"/>
+      </w:pPr>
+      <w:r>
+        <w:t xml:space="preserve">4.6 The Measured Lifecycle</w:t>
+      </w:r>
+    </w:p>
+    <w:p>
+      <w:pPr>
+        <w:pStyle w:val="FirstParagraph"/>
+      </w:pPr>
+      <w:r>
+        <w:t xml:space="preserve">An event-driven lifecycle is also, incidentally but not accidentally, a</w:t>
+      </w:r>
+      <w:r>
+        <w:t xml:space="preserve"> </w:t>
+      </w:r>
+      <w:r>
+        <w:rPr>
+          <w:i/>
+          <w:iCs/>
+        </w:rPr>
+        <w:t xml:space="preserve">measured</w:t>
+      </w:r>
+      <w:r>
+        <w:t xml:space="preserve"> </w:t>
+      </w:r>
+      <w:r>
+        <w:t xml:space="preserve">one — every event-to-action interval is a number, and the numbers are the slot-01 evidence stream:</w:t>
+      </w:r>
+    </w:p>
+    <w:p>
+      <w:pPr>
+        <w:pStyle w:val="TableCaption"/>
+      </w:pPr>
+      <w:r>
+        <w:t xml:space="preserve">The lifecycle metrics the event-driven architecture makes measurable</w:t>
+      </w:r>
+    </w:p>
+    <w:tbl>
+      <w:tblPr>
+        <w:tblStyle w:val="Table"/>
+        <w:tblW w:type="pct" w:w="5000"/>
+        <w:tblLayout w:type="fixed"/>
+        <w:tblLook w:firstRow="1" w:lastRow="0" w:firstColumn="0" w:lastColumn="0" w:noHBand="0" w:noVBand="0" w:val="0020"/>
+        <w:tblCaption w:val="The lifecycle metrics the event-driven architecture makes measurable"/>
+      </w:tblPr>
+      <w:tblGrid>
+        <w:gridCol w:w="2640"/>
+        <w:gridCol w:w="2640"/>
+        <w:gridCol w:w="2640"/>
+      </w:tblGrid>
+      <w:tr>
+        <w:trPr>
+          <w:tblHeader w:val="on"/>
+        </w:trPr>
+        <w:tc>
+          <w:tcPr/>
+          <w:p>
+            <w:pPr>
+              <w:pStyle w:val="Compact"/>
+            </w:pPr>
+            <w:r>
+              <w:t xml:space="preserve">Metric</w:t>
+            </w:r>
+          </w:p>
+        </w:tc>
+        <w:tc>
+          <w:tcPr/>
+          <w:p>
+            <w:pPr>
+              <w:pStyle w:val="Compact"/>
+            </w:pPr>
+            <w:r>
+              <w:t xml:space="preserve">Definition</w:t>
+            </w:r>
+          </w:p>
+        </w:tc>
+        <w:tc>
+          <w:tcPr/>
+          <w:p>
+            <w:pPr>
+              <w:pStyle w:val="Compact"/>
+            </w:pPr>
+            <w:r>
+              <w:t xml:space="preserve">What It Evidences</w:t>
+            </w:r>
+          </w:p>
+        </w:tc>
+      </w:tr>
+      <w:tr>
+        <w:tc>
+          <w:tcPr/>
+          <w:p>
+            <w:pPr>
+              <w:pStyle w:val="Compact"/>
+            </w:pPr>
+            <w:r>
+              <w:t xml:space="preserve">Separation-to-revocation interval</w:t>
+            </w:r>
+          </w:p>
+        </w:tc>
+        <w:tc>
+          <w:tcPr/>
+          <w:p>
+            <w:pPr>
+              <w:pStyle w:val="Compact"/>
+            </w:pPr>
+            <w:r>
+              <w:t xml:space="preserve">HR effective date/time → last revocation timestamp in the leaver sequence</w:t>
+            </w:r>
+          </w:p>
+        </w:tc>
+        <w:tc>
+          <w:tcPr/>
+          <w:p>
+            <w:pPr>
+              <w:pStyle w:val="Compact"/>
+            </w:pPr>
+            <w:r>
+              <w:t xml:space="preserve">PS-4’s disable-within-time-period, continuously</w:t>
+            </w:r>
+          </w:p>
+        </w:tc>
+      </w:tr>
+      <w:tr>
+        <w:tc>
+          <w:tcPr/>
+          <w:p>
+            <w:pPr>
+              <w:pStyle w:val="Compact"/>
+            </w:pPr>
+            <w:r>
+              <w:t xml:space="preserve">Transfer-to-review interval</w:t>
+            </w:r>
+          </w:p>
+        </w:tc>
+        <w:tc>
+          <w:tcPr/>
+          <w:p>
+            <w:pPr>
+              <w:pStyle w:val="Compact"/>
+            </w:pPr>
+            <w:r>
+              <w:t xml:space="preserve">Transfer effective date → residual-access review completion</w:t>
+            </w:r>
+          </w:p>
+        </w:tc>
+        <w:tc>
+          <w:tcPr/>
+          <w:p>
+            <w:pPr>
+              <w:pStyle w:val="Compact"/>
+            </w:pPr>
+            <w:r>
+              <w:t xml:space="preserve">PS-5’s initiate-within-time-period</w:t>
+            </w:r>
+          </w:p>
+        </w:tc>
+      </w:tr>
+      <w:tr>
+        <w:tc>
+          <w:tcPr/>
+          <w:p>
+            <w:pPr>
+              <w:pStyle w:val="Compact"/>
+            </w:pPr>
+            <w:r>
+              <w:t xml:space="preserve">Joiner readiness rate</w:t>
+            </w:r>
+          </w:p>
+        </w:tc>
+        <w:tc>
+          <w:tcPr/>
+          <w:p>
+            <w:pPr>
+              <w:pStyle w:val="Compact"/>
+            </w:pPr>
+            <w:r>
+              <w:t xml:space="preserve">Share of new hires whose account, licenses, and baseline access exist at start-of-day one</w:t>
+            </w:r>
+          </w:p>
+        </w:tc>
+        <w:tc>
+          <w:tcPr/>
+          <w:p>
+            <w:pPr>
+              <w:pStyle w:val="Compact"/>
+            </w:pPr>
+            <w:r>
+              <w:t xml:space="preserve">AC-2 lifecycle automation working in the creation direction</w:t>
+            </w:r>
+          </w:p>
+        </w:tc>
+      </w:tr>
+      <w:tr>
+        <w:tc>
+          <w:tcPr/>
+          <w:p>
+            <w:pPr>
+              <w:pStyle w:val="Compact"/>
+            </w:pPr>
+            <w:r>
+              <w:t xml:space="preserve">Correlation coverage</w:t>
+            </w:r>
+          </w:p>
+        </w:tc>
+        <w:tc>
+          <w:tcPr/>
+          <w:p>
+            <w:pPr>
+              <w:pStyle w:val="Compact"/>
+            </w:pPr>
+            <w:r>
+              <w:t xml:space="preserve">Share of enabled accounts resolvable to a current worker record</w:t>
+            </w:r>
+          </w:p>
+        </w:tc>
+        <w:tc>
+          <w:tcPr/>
+          <w:p>
+            <w:pPr>
+              <w:pStyle w:val="Compact"/>
+            </w:pPr>
+            <w:r>
+              <w:t xml:space="preserve">The orphan population, as a query instead of a hunt</w:t>
+            </w:r>
+          </w:p>
+        </w:tc>
+      </w:tr>
+      <w:tr>
+        <w:tc>
+          <w:tcPr/>
+          <w:p>
+            <w:pPr>
+              <w:pStyle w:val="Compact"/>
+            </w:pPr>
+            <w:r>
+              <w:t xml:space="preserve">Derivation purity</w:t>
+            </w:r>
+          </w:p>
+        </w:tc>
+        <w:tc>
+          <w:tcPr/>
+          <w:p>
+            <w:pPr>
+              <w:pStyle w:val="Compact"/>
+            </w:pPr>
+            <w:r>
+              <w:t xml:space="preserve">Share of group memberships computed by rule versus assigned by hand</w:t>
+            </w:r>
+          </w:p>
+        </w:tc>
+        <w:tc>
+          <w:tcPr/>
+          <w:p>
+            <w:pPr>
+              <w:pStyle w:val="Compact"/>
+            </w:pPr>
+            <w:r>
+              <w:t xml:space="preserve">How much of the estate still runs on fragments</w:t>
+            </w:r>
+          </w:p>
+        </w:tc>
+      </w:tr>
+    </w:tbl>
+    <w:p>
+      <w:pPr>
+        <w:pStyle w:val="BodyText"/>
+      </w:pPr>
+      <w:r>
+        <w:t xml:space="preserve">None of these numbers exists in a ticket-driven estate — not because nobody computes them, but because the events they measure are not recorded as events. The metric</w:t>
+      </w:r>
+      <w:r>
+        <w:t xml:space="preserve"> </w:t>
+      </w:r>
+      <w:r>
+        <w:rPr>
+          <w:i/>
+          <w:iCs/>
+        </w:rPr>
+        <w:t xml:space="preserve">is</w:t>
+      </w:r>
+      <w:r>
+        <w:t xml:space="preserve"> </w:t>
+      </w:r>
+      <w:r>
+        <w:t xml:space="preserve">the argument: an architecture that cannot measure its own revocation latency is asserting PS-4 compliance on faith.</w:t>
+      </w:r>
+    </w:p>
     <w:bookmarkEnd w:id="62"/>
     <w:bookmarkEnd w:id="63"/>
-    <w:bookmarkStart w:id="69" w:name="X65448c4ef8c56761744cefe28de67a9bb67265e"/>
+    <w:bookmarkStart w:id="71" w:name="the-organizational-ssot"/>
+    <w:p>
+      <w:pPr>
+        <w:pStyle w:val="Heading1"/>
+      </w:pPr>
+      <w:r>
+        <w:t xml:space="preserve">5. The Organizational SSOT</w:t>
+      </w:r>
+    </w:p>
+    <w:bookmarkStart w:id="64" w:name="structure-as-queryable-truth"/>
+    <w:p>
+      <w:pPr>
+        <w:pStyle w:val="Heading2"/>
+      </w:pPr>
+      <w:r>
+        <w:t xml:space="preserve">5.1 Structure as Queryable Truth</w:t>
+      </w:r>
+    </w:p>
+    <w:p>
+      <w:pPr>
+        <w:pStyle w:val="FirstParagraph"/>
+      </w:pPr>
+      <w:r>
+        <w:t xml:space="preserve">The second half of this book’s title is the one estates habitually skip. Identity SSOT projects say</w:t>
+      </w:r>
+      <w:r>
+        <w:t xml:space="preserve"> </w:t>
+      </w:r>
+      <w:r>
+        <w:t xml:space="preserve">“HR drives accounts”</w:t>
+      </w:r>
+      <w:r>
+        <w:t xml:space="preserve"> </w:t>
+      </w:r>
+      <w:r>
+        <w:t xml:space="preserve">and stop — leaving</w:t>
+      </w:r>
+      <w:r>
+        <w:t xml:space="preserve"> </w:t>
+      </w:r>
+      <w:r>
+        <w:rPr>
+          <w:i/>
+          <w:iCs/>
+        </w:rPr>
+        <w:t xml:space="preserve">organizational</w:t>
+      </w:r>
+      <w:r>
+        <w:t xml:space="preserve"> </w:t>
+      </w:r>
+      <w:r>
+        <w:t xml:space="preserve">truth (who reports to whom, which positions exist, which cost center pays) in the OU paths and the Visio files. The result is an identity plane that knows who exists but not where they sit, which forces every access decision back onto hand-maintained groups — and hand-maintained groups are per-system account stores wearing a nicer name.</w:t>
+      </w:r>
+    </w:p>
+    <w:p>
+      <w:pPr>
+        <w:pStyle w:val="BodyText"/>
+      </w:pPr>
+      <w:r>
+        <w:t xml:space="preserve">The organizational SSOT makes three record families queryable:</w:t>
+      </w:r>
+    </w:p>
+    <w:p>
+      <w:pPr>
+        <w:pStyle w:val="Compact"/>
+        <w:numPr>
+          <w:ilvl w:val="0"/>
+          <w:numId w:val="1007"/>
+        </w:numPr>
+      </w:pPr>
+      <w:r>
+        <w:rPr>
+          <w:b/>
+          <w:bCs/>
+        </w:rPr>
+        <w:t xml:space="preserve">Supervisory organization.</w:t>
+      </w:r>
+      <w:r>
+        <w:t xml:space="preserve"> </w:t>
+      </w:r>
+      <w:r>
+        <w:t xml:space="preserve">The reporting hierarchy as effective-dated records: any worker’s chain of command, resolvable by API at decision time. This is the fact that access-package approvals, attestation campaigns, and separation-of-duties checks all silently depend on — and today mostly fake with a stale directory</w:t>
+      </w:r>
+      <w:r>
+        <w:t xml:space="preserve"> </w:t>
+      </w:r>
+      <w:r>
+        <w:rPr>
+          <w:rStyle w:val="VerbatimChar"/>
+        </w:rPr>
+        <w:t xml:space="preserve">manager</w:t>
+      </w:r>
+      <w:r>
+        <w:t xml:space="preserve"> </w:t>
+      </w:r>
+      <w:r>
+        <w:t xml:space="preserve">field.</w:t>
+      </w:r>
+    </w:p>
+    <w:p>
+      <w:pPr>
+        <w:pStyle w:val="Compact"/>
+        <w:numPr>
+          <w:ilvl w:val="0"/>
+          <w:numId w:val="1007"/>
+        </w:numPr>
+      </w:pPr>
+      <w:r>
+        <w:rPr>
+          <w:b/>
+          <w:bCs/>
+        </w:rPr>
+        <w:t xml:space="preserve">Position management.</w:t>
+      </w:r>
+      <w:r>
+        <w:t xml:space="preserve"> </w:t>
+      </w:r>
+      <w:r>
+        <w:t xml:space="preserve">Positions as records independent of incumbents. Access eligibility attaches to the</w:t>
+      </w:r>
+      <w:r>
+        <w:t xml:space="preserve"> </w:t>
+      </w:r>
+      <w:r>
+        <w:rPr>
+          <w:i/>
+          <w:iCs/>
+        </w:rPr>
+        <w:t xml:space="preserve">position</w:t>
+      </w:r>
+      <w:r>
+        <w:t xml:space="preserve"> </w:t>
+      </w:r>
+      <w:r>
+        <w:t xml:space="preserve">(</w:t>
+      </w:r>
+      <w:r>
+        <w:t xml:space="preserve">“this seat is entitled to the case-processing system”</w:t>
+      </w:r>
+      <w:r>
+        <w:t xml:space="preserve">), so a vacancy holds no access, an incumbent inherits the seat’s baseline on assignment, and a mover sheds it on reassignment — automatically, because the assignment is the membership rule’s input.</w:t>
+      </w:r>
+    </w:p>
+    <w:p>
+      <w:pPr>
+        <w:pStyle w:val="Compact"/>
+        <w:numPr>
+          <w:ilvl w:val="0"/>
+          <w:numId w:val="1007"/>
+        </w:numPr>
+      </w:pPr>
+      <w:r>
+        <w:rPr>
+          <w:b/>
+          <w:bCs/>
+        </w:rPr>
+        <w:t xml:space="preserve">Cost centers.</w:t>
+      </w:r>
+      <w:r>
+        <w:t xml:space="preserve"> </w:t>
+      </w:r>
+      <w:r>
+        <w:t xml:space="preserve">The financial dimension of placement, driving license chargeback and scoping the blast radius of any entitlement to the organizational unit that owns it.</w:t>
+      </w:r>
+    </w:p>
+    <w:p>
+      <w:pPr>
+        <w:pStyle w:val="FirstParagraph"/>
+      </w:pPr>
+      <w:hyperlink r:id="rId18">
+        <w:r>
+          <w:rPr>
+            <w:rStyle w:val="Hyperlink"/>
+          </w:rPr>
+          <w:t xml:space="preserve">Book 05</w:t>
+        </w:r>
+      </w:hyperlink>
+      <w:r>
+        <w:t xml:space="preserve">’s history explains why this matters at reorganization time. Under fragmented truth, a reorganization is a</w:t>
+      </w:r>
+      <w:r>
+        <w:t xml:space="preserve"> </w:t>
+      </w:r>
+      <w:r>
+        <w:rPr>
+          <w:i/>
+          <w:iCs/>
+        </w:rPr>
+        <w:t xml:space="preserve">migration project</w:t>
+      </w:r>
+      <w:r>
+        <w:t xml:space="preserve">: OU restructuring, group renames, GPO re-links, months of drift. Under the organizational SSOT, a reorganization is a</w:t>
+      </w:r>
+      <w:r>
+        <w:t xml:space="preserve"> </w:t>
+      </w:r>
+      <w:r>
+        <w:rPr>
+          <w:i/>
+          <w:iCs/>
+        </w:rPr>
+        <w:t xml:space="preserve">data change</w:t>
+      </w:r>
+      <w:r>
+        <w:t xml:space="preserve"> </w:t>
+      </w:r>
+      <w:r>
+        <w:t xml:space="preserve">— the HR records change, the attributes re-stamp, the memberships recompute — and the doctrinal corollary follows: a drifted OU estate is</w:t>
+      </w:r>
+      <w:r>
+        <w:t xml:space="preserve"> </w:t>
+      </w:r>
+      <w:r>
+        <w:rPr>
+          <w:b/>
+          <w:bCs/>
+        </w:rPr>
+        <w:t xml:space="preserve">overlaid and retired, not remediated</w:t>
+      </w:r>
+      <w:r>
+        <w:t xml:space="preserve">. Rebuilding OU trees to match reality is expensive, high-risk, and pointless once no policy reads OU position; the truth is stamped as attributes, policy re-bases onto attribute-driven groups, and the residual OU bindings are inventoried and decommissioned deliberately.</w:t>
+      </w:r>
+    </w:p>
+    <w:bookmarkEnd w:id="64"/>
+    <w:bookmarkStart w:id="65" w:name="X1c44efed6f59a195bc8d7df37c3cec34f95e174"/>
+    <w:p>
+      <w:pPr>
+        <w:pStyle w:val="Heading2"/>
+      </w:pPr>
+      <w:r>
+        <w:t xml:space="preserve">5.2 From HR Attributes to Access: The Derivation Chain</w:t>
+      </w:r>
+    </w:p>
+    <w:p>
+      <w:pPr>
+        <w:pStyle w:val="FirstParagraph"/>
+      </w:pPr>
+      <w:r>
+        <w:t xml:space="preserve">The organizational SSOT earns its keep through one repeatable chain:</w:t>
+      </w:r>
+    </w:p>
+    <w:p>
+      <w:pPr>
+        <w:pStyle w:val="BodyText"/>
+      </w:pPr>
+      <w:r>
+        <w:rPr>
+          <w:b/>
+          <w:bCs/>
+        </w:rPr>
+        <w:t xml:space="preserve">Worker record → stamped attributes → dynamic groups → entitlements.</w:t>
+      </w:r>
+    </w:p>
+    <w:p>
+      <w:pPr>
+        <w:pStyle w:val="BodyText"/>
+      </w:pPr>
+      <w:r>
+        <w:t xml:space="preserve">Dynamic groups are membership</w:t>
+      </w:r>
+      <w:r>
+        <w:t xml:space="preserve"> </w:t>
+      </w:r>
+      <w:r>
+        <w:rPr>
+          <w:i/>
+          <w:iCs/>
+        </w:rPr>
+        <w:t xml:space="preserve">rules</w:t>
+      </w:r>
+      <w:r>
+        <w:t xml:space="preserve"> </w:t>
+      </w:r>
+      <w:r>
+        <w:t xml:space="preserve">over HR-derived attributes (</w:t>
+      </w:r>
+      <w:r>
+        <w:t xml:space="preserve">“all workers whose org code is under X and worker type is employee”</w:t>
+      </w:r>
+      <w:r>
+        <w:t xml:space="preserve">), evaluated continuously by the identity platform. Access packages bundle entitlements behind eligibility rules and approval flows that route to the supervisor</w:t>
+      </w:r>
+      <w:r>
+        <w:t xml:space="preserve"> </w:t>
+      </w:r>
+      <w:r>
+        <w:rPr>
+          <w:i/>
+          <w:iCs/>
+        </w:rPr>
+        <w:t xml:space="preserve">of record</w:t>
+      </w:r>
+      <w:r>
+        <w:t xml:space="preserve">. Conditional access and application roles consume the same attributes as ABAC inputs, and role assignments — RBAC — are granted through the packages rather than by direct assignment. The properties that follow:</w:t>
+      </w:r>
+    </w:p>
+    <w:p>
+      <w:pPr>
+        <w:pStyle w:val="Compact"/>
+        <w:numPr>
+          <w:ilvl w:val="0"/>
+          <w:numId w:val="1008"/>
+        </w:numPr>
+      </w:pPr>
+      <w:r>
+        <w:rPr>
+          <w:b/>
+          <w:bCs/>
+        </w:rPr>
+        <w:t xml:space="preserve">Nobody joins these groups; membership is computed.</w:t>
+      </w:r>
+      <w:r>
+        <w:t xml:space="preserve"> </w:t>
+      </w:r>
+      <w:r>
+        <w:t xml:space="preserve">There is no group owner to lobby, no ticket to lose, no offboarding step to forget. The mover’s access converges on the new assignment’s derivation within the provisioning cycle.</w:t>
+      </w:r>
+    </w:p>
+    <w:p>
+      <w:pPr>
+        <w:pStyle w:val="Compact"/>
+        <w:numPr>
+          <w:ilvl w:val="0"/>
+          <w:numId w:val="1008"/>
+        </w:numPr>
+      </w:pPr>
+      <w:r>
+        <w:rPr>
+          <w:b/>
+          <w:bCs/>
+        </w:rPr>
+        <w:t xml:space="preserve">Every entitlement has a</w:t>
+      </w:r>
+      <w:r>
+        <w:rPr>
+          <w:b/>
+          <w:bCs/>
+        </w:rPr>
+        <w:t xml:space="preserve"> </w:t>
+      </w:r>
+      <w:r>
+        <w:rPr>
+          <w:b/>
+          <w:bCs/>
+          <w:i/>
+          <w:iCs/>
+        </w:rPr>
+        <w:t xml:space="preserve">because</w:t>
+      </w:r>
+      <w:r>
+        <w:rPr>
+          <w:b/>
+          <w:bCs/>
+        </w:rPr>
+        <w:t xml:space="preserve">.</w:t>
+      </w:r>
+      <w:r>
+        <w:t xml:space="preserve"> </w:t>
+      </w:r>
+      <w:r>
+        <w:t xml:space="preserve">Access exists because an attribute satisfied a rule; the attribute exists because an HR record asserted it; the record has an author, a date, and a business act behind it. That chain</w:t>
+      </w:r>
+      <w:r>
+        <w:t xml:space="preserve"> </w:t>
+      </w:r>
+      <w:r>
+        <w:rPr>
+          <w:i/>
+          <w:iCs/>
+        </w:rPr>
+        <w:t xml:space="preserve">is</w:t>
+      </w:r>
+      <w:r>
+        <w:t xml:space="preserve"> </w:t>
+      </w:r>
+      <w:r>
+        <w:t xml:space="preserve">the access authorization data AC-2 wants, and it is queryable end to end.</w:t>
+      </w:r>
+    </w:p>
+    <w:p>
+      <w:pPr>
+        <w:pStyle w:val="Compact"/>
+        <w:numPr>
+          <w:ilvl w:val="0"/>
+          <w:numId w:val="1008"/>
+        </w:numPr>
+      </w:pPr>
+      <w:r>
+        <w:rPr>
+          <w:b/>
+          <w:bCs/>
+        </w:rPr>
+        <w:t xml:space="preserve">ABAC and RBAC stop being rival religions.</w:t>
+      </w:r>
+      <w:r>
+        <w:t xml:space="preserve"> </w:t>
+      </w:r>
+      <w:r>
+        <w:t xml:space="preserve">Roles define what a position may touch; attributes prove which position the person holds. Both resolve against the same upstream truth, which is the only arrangement in which they cannot disagree.</w:t>
+      </w:r>
+    </w:p>
+    <w:bookmarkEnd w:id="65"/>
+    <w:bookmarkStart w:id="70" w:name="attestation-lands-on-the-same-rail"/>
+    <w:p>
+      <w:pPr>
+        <w:pStyle w:val="Heading2"/>
+      </w:pPr>
+      <w:r>
+        <w:t xml:space="preserve">5.3 Attestation Lands on the Same Rail</w:t>
+      </w:r>
+    </w:p>
+    <w:p>
+      <w:pPr>
+        <w:pStyle w:val="FirstParagraph"/>
+      </w:pPr>
+      <w:r>
+        <w:t xml:space="preserve">The access reviews this book declined to accept as a</w:t>
+      </w:r>
+      <w:r>
+        <w:t xml:space="preserve"> </w:t>
+      </w:r>
+      <w:r>
+        <w:rPr>
+          <w:i/>
+          <w:iCs/>
+        </w:rPr>
+        <w:t xml:space="preserve">source</w:t>
+      </w:r>
+      <w:r>
+        <w:t xml:space="preserve"> </w:t>
+      </w:r>
+      <w:r>
+        <w:t xml:space="preserve">of truth return here as a sharpened</w:t>
+      </w:r>
+      <w:r>
+        <w:t xml:space="preserve"> </w:t>
+      </w:r>
+      <w:r>
+        <w:rPr>
+          <w:i/>
+          <w:iCs/>
+        </w:rPr>
+        <w:t xml:space="preserve">verification</w:t>
+      </w:r>
+      <w:r>
+        <w:t xml:space="preserve"> </w:t>
+      </w:r>
+      <w:r>
+        <w:t xml:space="preserve">of it. Once entitlements derive from the organizational SSOT, AC-2(j)’s periodic review stops being a spreadsheet mailed to whoever a stale directory field names, and becomes a campaign the org SSOT itself scopes and routes:</w:t>
+      </w:r>
+    </w:p>
+    <w:p>
+      <w:pPr>
+        <w:pStyle w:val="Compact"/>
+        <w:numPr>
+          <w:ilvl w:val="0"/>
+          <w:numId w:val="1009"/>
+        </w:numPr>
+      </w:pPr>
+      <w:r>
+        <w:rPr>
+          <w:b/>
+          <w:bCs/>
+        </w:rPr>
+        <w:t xml:space="preserve">The reviewer is the supervisor of record</w:t>
+      </w:r>
+      <w:r>
+        <w:t xml:space="preserve"> </w:t>
+      </w:r>
+      <w:r>
+        <w:t xml:space="preserve">— resolved from the reporting hierarchy at campaign launch, not from a</w:t>
+      </w:r>
+      <w:r>
+        <w:t xml:space="preserve"> </w:t>
+      </w:r>
+      <w:r>
+        <w:rPr>
+          <w:rStyle w:val="VerbatimChar"/>
+        </w:rPr>
+        <w:t xml:space="preserve">manager</w:t>
+      </w:r>
+      <w:r>
+        <w:t xml:space="preserve"> </w:t>
+      </w:r>
+      <w:r>
+        <w:t xml:space="preserve">field last edited during a previous administration.</w:t>
+      </w:r>
+    </w:p>
+    <w:p>
+      <w:pPr>
+        <w:pStyle w:val="Compact"/>
+        <w:numPr>
+          <w:ilvl w:val="0"/>
+          <w:numId w:val="1009"/>
+        </w:numPr>
+      </w:pPr>
+      <w:r>
+        <w:rPr>
+          <w:b/>
+          <w:bCs/>
+        </w:rPr>
+        <w:t xml:space="preserve">The review population is attribute-scoped</w:t>
+      </w:r>
+      <w:r>
+        <w:t xml:space="preserve"> </w:t>
+      </w:r>
+      <w:r>
+        <w:t xml:space="preserve">—</w:t>
+      </w:r>
+      <w:r>
+        <w:t xml:space="preserve"> </w:t>
+      </w:r>
+      <w:r>
+        <w:t xml:space="preserve">“all workers in this organization with access outside its derivation baseline”</w:t>
+      </w:r>
+      <w:r>
+        <w:t xml:space="preserve"> </w:t>
+      </w:r>
+      <w:r>
+        <w:t xml:space="preserve">is a query, so reviewers see the</w:t>
+      </w:r>
+      <w:r>
+        <w:t xml:space="preserve"> </w:t>
+      </w:r>
+      <w:r>
+        <w:rPr>
+          <w:i/>
+          <w:iCs/>
+        </w:rPr>
+        <w:t xml:space="preserve">exceptions</w:t>
+      </w:r>
+      <w:r>
+        <w:t xml:space="preserve"> </w:t>
+      </w:r>
+      <w:r>
+        <w:t xml:space="preserve">rather than four hundred rubber-stampable rows.</w:t>
+      </w:r>
+    </w:p>
+    <w:p>
+      <w:pPr>
+        <w:pStyle w:val="Compact"/>
+        <w:numPr>
+          <w:ilvl w:val="0"/>
+          <w:numId w:val="1009"/>
+        </w:numPr>
+      </w:pPr>
+      <w:r>
+        <w:rPr>
+          <w:b/>
+          <w:bCs/>
+        </w:rPr>
+        <w:t xml:space="preserve">The review outcome is a record correction</w:t>
+      </w:r>
+      <w:r>
+        <w:t xml:space="preserve"> </w:t>
+      </w:r>
+      <w:r>
+        <w:t xml:space="preserve">— a rejected entitlement is removed by fixing the attribute, the rule, or the exception entry that produced it, so the same wrong answer cannot regrow from the same wrong input.</w:t>
+      </w:r>
+    </w:p>
+    <w:p>
+      <w:pPr>
+        <w:pStyle w:val="FirstParagraph"/>
+      </w:pPr>
+      <w:r>
+        <w:t xml:space="preserve">The separation-of-duties checks of later parts read the same rails: conflicting-role detection needs to know that two roles are held by the same</w:t>
+      </w:r>
+      <w:r>
+        <w:t xml:space="preserve"> </w:t>
+      </w:r>
+      <w:r>
+        <w:rPr>
+          <w:i/>
+          <w:iCs/>
+        </w:rPr>
+        <w:t xml:space="preserve">person</w:t>
+      </w:r>
+      <w:r>
+        <w:t xml:space="preserve"> </w:t>
+      </w:r>
+      <w:r>
+        <w:t xml:space="preserve">(the IA-4 anchor) and whether an approver</w:t>
+      </w:r>
+      <w:r>
+        <w:t xml:space="preserve"> </w:t>
+      </w:r>
+      <w:r>
+        <w:rPr>
+          <w:i/>
+          <w:iCs/>
+        </w:rPr>
+        <w:t xml:space="preserve">reports to</w:t>
+      </w:r>
+      <w:r>
+        <w:t xml:space="preserve"> </w:t>
+      </w:r>
+      <w:r>
+        <w:t xml:space="preserve">the requester (the supervisory org). Both facts are queries against this book’s records; neither is answerable from a directory that tracks accounts and drawings that track boxes.</w:t>
+      </w:r>
+    </w:p>
+    <w:tbl>
+      <w:tblPr>
+        <w:tblStyle w:val="Table"/>
+        <w:tblW w:type="pct" w:w="5000"/>
+        <w:tblLayout w:type="fixed"/>
+        <w:tblLook w:firstRow="0" w:lastRow="0" w:firstColumn="0" w:lastColumn="0" w:noHBand="0" w:noVBand="0" w:val="0000"/>
+      </w:tblPr>
+      <w:tblGrid>
+        <w:gridCol w:w="7920"/>
+      </w:tblGrid>
+      <w:tr>
+        <w:tc>
+          <w:tcPr/>
+          <w:bookmarkStart w:id="69" w:name="fig-hrit04"/>
+          <w:p>
+            <w:pPr>
+              <w:pStyle w:val="Compact"/>
+              <w:jc w:val="center"/>
+            </w:pPr>
+            <w:r>
+              <w:drawing>
+                <wp:inline>
+                  <wp:extent cx="5334000" cy="3000375"/>
+                  <wp:effectExtent b="0" l="0" r="0" t="0"/>
+                  <wp:docPr descr="" title="" id="67" name="Picture"/>
+                  <a:graphic>
+                    <a:graphicData uri="http://schemas.openxmlformats.org/drawingml/2006/picture">
+                      <pic:pic>
+                        <pic:nvPicPr>
+                          <pic:cNvPr descr="figs/hrit-fig-04-org-ssot-derivation.png" id="68" name="Picture"/>
+                          <pic:cNvPicPr>
+                            <a:picLocks noChangeArrowheads="1" noChangeAspect="1"/>
+                          </pic:cNvPicPr>
+                        </pic:nvPicPr>
+                        <pic:blipFill>
+                          <a:blip r:embed="rId66"/>
+                          <a:stretch>
+                            <a:fillRect/>
+                          </a:stretch>
+                        </pic:blipFill>
+                        <pic:spPr bwMode="auto">
+                          <a:xfrm>
+                            <a:off x="0" y="0"/>
+                            <a:ext cx="5334000" cy="3000375"/>
+                          </a:xfrm>
+                          <a:prstGeom prst="rect">
+                            <a:avLst/>
+                          </a:prstGeom>
+                          <a:noFill/>
+                          <a:ln w="9525">
+                            <a:noFill/>
+                            <a:headEnd/>
+                            <a:tailEnd/>
+                          </a:ln>
+                        </pic:spPr>
+                      </pic:pic>
+                    </a:graphicData>
+                  </a:graphic>
+                </wp:inline>
+              </w:drawing>
+            </w:r>
+          </w:p>
+          <w:p>
+            <w:pPr>
+              <w:jc w:val="center"/>
+            </w:pPr>
+            <w:pPr>
+              <w:jc w:val="left"/>
+              <w:spacing w:before="200"/>
+              <w:pStyle w:val="ImageCaption"/>
+            </w:pPr>
+            <w:r>
+              <w:t xml:space="preserve">Figure 6: The organizational SSOT derivation chain from HR record to entitlement</w:t>
+            </w:r>
+          </w:p>
+          <w:bookmarkEnd w:id="69"/>
+        </w:tc>
+      </w:tr>
+    </w:tbl>
+    <w:bookmarkEnd w:id="70"/>
+    <w:bookmarkEnd w:id="71"/>
+    <w:bookmarkStart w:id="77" w:name="X65448c4ef8c56761744cefe28de67a9bb67265e"/>
     <w:p>
       <w:pPr>
         <w:pStyle w:val="Heading1"/>
@@ -6181,7 +6360,7 @@
         <w:t xml:space="preserve">the integration prerequisites: the federation trust is a Book 03 token relationship; the provisioning pipeline authenticates with a Book 03 workload credential; the tenancy’s endpoints resolve through Book 01’s validating resolvers; and the DNS names those endpoints use are exactly the class of external dependency the naming plane’s egress policies already govern. An agency that built Parts 1–3 has already built everything this integration touches. Second, the pattern generalizes: every future SaaS adoption should be evaluated on the same four surfaces — how it federates, how it provisions, how it resolves, how it exports evidence — and a candidate that demands enforcement-plane coupling (a site-to-site tunnel, an installed agent inside the boundary, a shared OS credential) is asking to be treated as infrastructure, with infrastructure’s obligations. The system of record is the template, not the exception.</w:t>
       </w:r>
     </w:p>
-    <w:bookmarkStart w:id="68" w:name="what-this-sets-up"/>
+    <w:bookmarkStart w:id="76" w:name="what-this-sets-up"/>
     <w:p>
       <w:pPr>
         <w:pStyle w:val="Heading2"/>
@@ -6287,7 +6466,7 @@
             <w:pPr>
               <w:pStyle w:val="Compact"/>
             </w:pPr>
-            <w:hyperlink r:id="rId64">
+            <w:hyperlink r:id="rId72">
               <w:r>
                 <w:rPr>
                   <w:rStyle w:val="Hyperlink"/>
@@ -6409,7 +6588,7 @@
             <w:pPr>
               <w:pStyle w:val="Compact"/>
             </w:pPr>
-            <w:hyperlink r:id="rId65">
+            <w:hyperlink r:id="rId73">
               <w:r>
                 <w:rPr>
                   <w:rStyle w:val="Hyperlink"/>
@@ -6487,12 +6666,12 @@
                 <wp:inline>
                   <wp:extent cx="152400" cy="152400"/>
                   <wp:effectExtent b="0" l="0" r="0" t="0"/>
-                  <wp:docPr descr="" title="" id="66" name="Picture"/>
+                  <wp:docPr descr="" title="" id="74" name="Picture"/>
                   <a:graphic>
                     <a:graphicData uri="http://schemas.openxmlformats.org/drawingml/2006/picture">
                       <pic:pic>
                         <pic:nvPicPr>
-                          <pic:cNvPr descr="/opt/quarto/share/formats/docx/warning.png" id="67" name="Picture"/>
+                          <pic:cNvPr descr="C:\Program Files\Quarto\share\formats\docx\warning.png" id="75" name="Picture"/>
                           <pic:cNvPicPr>
                             <a:picLocks noChangeArrowheads="1" noChangeAspect="1"/>
                           </pic:cNvPicPr>
@@ -6585,9 +6764,9 @@
         </w:tc>
       </w:tr>
     </w:tbl>
-    <w:bookmarkEnd w:id="68"/>
-    <w:bookmarkEnd w:id="69"/>
-    <w:bookmarkStart w:id="75" w:name="phased-implementation"/>
+    <w:bookmarkEnd w:id="76"/>
+    <w:bookmarkEnd w:id="77"/>
+    <w:bookmarkStart w:id="87" w:name="phased-implementation"/>
     <w:p>
       <w:pPr>
         <w:pStyle w:val="Heading1"/>
@@ -6649,7 +6828,86 @@
         <w:t xml:space="preserve">— a drifted HR feed produces a drifted SSOT, so data-quality remediation is Phase 1 work, not a someday.</w:t>
       </w:r>
     </w:p>
-    <w:bookmarkStart w:id="70" w:name="X26f02255fa42d4b39ecb8211c828a6e302e49b3"/>
+    <w:tbl>
+      <w:tblPr>
+        <w:tblStyle w:val="Table"/>
+        <w:tblW w:type="pct" w:w="5000"/>
+        <w:tblLayout w:type="fixed"/>
+        <w:tblLook w:firstRow="0" w:lastRow="0" w:firstColumn="0" w:lastColumn="0" w:noHBand="0" w:noVBand="0" w:val="0000"/>
+      </w:tblPr>
+      <w:tblGrid>
+        <w:gridCol w:w="7920"/>
+      </w:tblGrid>
+      <w:tr>
+        <w:tc>
+          <w:tcPr/>
+          <w:bookmarkStart w:id="81" w:name="fig-hrit07"/>
+          <w:p>
+            <w:pPr>
+              <w:pStyle w:val="Compact"/>
+              <w:jc w:val="center"/>
+            </w:pPr>
+            <w:r>
+              <w:drawing>
+                <wp:inline>
+                  <wp:extent cx="5334000" cy="3000375"/>
+                  <wp:effectExtent b="0" l="0" r="0" t="0"/>
+                  <wp:docPr descr="" title="" id="79" name="Picture"/>
+                  <a:graphic>
+                    <a:graphicData uri="http://schemas.openxmlformats.org/drawingml/2006/picture">
+                      <pic:pic>
+                        <pic:nvPicPr>
+                          <pic:cNvPr descr="figs/hrit-fig-07-phased-implementation.png" id="80" name="Picture"/>
+                          <pic:cNvPicPr>
+                            <a:picLocks noChangeArrowheads="1" noChangeAspect="1"/>
+                          </pic:cNvPicPr>
+                        </pic:nvPicPr>
+                        <pic:blipFill>
+                          <a:blip r:embed="rId78"/>
+                          <a:stretch>
+                            <a:fillRect/>
+                          </a:stretch>
+                        </pic:blipFill>
+                        <pic:spPr bwMode="auto">
+                          <a:xfrm>
+                            <a:off x="0" y="0"/>
+                            <a:ext cx="5334000" cy="3000375"/>
+                          </a:xfrm>
+                          <a:prstGeom prst="rect">
+                            <a:avLst/>
+                          </a:prstGeom>
+                          <a:noFill/>
+                          <a:ln w="9525">
+                            <a:noFill/>
+                            <a:headEnd/>
+                            <a:tailEnd/>
+                          </a:ln>
+                        </pic:spPr>
+                      </pic:pic>
+                    </a:graphicData>
+                  </a:graphic>
+                </wp:inline>
+              </w:drawing>
+            </w:r>
+          </w:p>
+          <w:p>
+            <w:pPr>
+              <w:jc w:val="center"/>
+            </w:pPr>
+            <w:pPr>
+              <w:jc w:val="left"/>
+              <w:spacing w:before="200"/>
+              <w:pStyle w:val="ImageCaption"/>
+            </w:pPr>
+            <w:r>
+              <w:t xml:space="preserve">Figure 7: The four implementation phases and their gates — truth, pipe, actions, derivations</w:t>
+            </w:r>
+          </w:p>
+          <w:bookmarkEnd w:id="81"/>
+        </w:tc>
+      </w:tr>
+    </w:tbl>
+    <w:bookmarkStart w:id="82" w:name="X26f02255fa42d4b39ecb8211c828a6e302e49b3"/>
     <w:p>
       <w:pPr>
         <w:pStyle w:val="Heading2"/>
@@ -6696,8 +6954,8 @@
         <w:t xml:space="preserve">the authority map is signed; every enabled account is either correlated to a worker record or on a dated exception list.</w:t>
       </w:r>
     </w:p>
-    <w:bookmarkEnd w:id="70"/>
-    <w:bookmarkStart w:id="71" w:name="X3efec994e51c0649d4baf2b0039fc8ce2ae55ca"/>
+    <w:bookmarkEnd w:id="82"/>
+    <w:bookmarkStart w:id="83" w:name="X3efec994e51c0649d4baf2b0039fc8ce2ae55ca"/>
     <w:p>
       <w:pPr>
         <w:pStyle w:val="Heading2"/>
@@ -6763,8 +7021,8 @@
         <w:t xml:space="preserve">thirty days of shadow operation in which every pipeline-versus-directory difference is explained — either a directory error (fixed downstream) or a source error (fixed in HR); provenance records emitted for 100% of events.</w:t>
       </w:r>
     </w:p>
-    <w:bookmarkEnd w:id="71"/>
-    <w:bookmarkStart w:id="72" w:name="phase-3-lifecycle-automation-weeks-1526"/>
+    <w:bookmarkEnd w:id="83"/>
+    <w:bookmarkStart w:id="84" w:name="phase-3-lifecycle-automation-weeks-1526"/>
     <w:p>
       <w:pPr>
         <w:pStyle w:val="Heading2"/>
@@ -6799,8 +7057,8 @@
         <w:t xml:space="preserve">separation-to-revocation measured in hours across a full pay-period cycle with zero missed leavers; joiner day-one readiness demonstrated; the account-creation ticket queue retired for covered populations.</w:t>
       </w:r>
     </w:p>
-    <w:bookmarkEnd w:id="72"/>
-    <w:bookmarkStart w:id="73" w:name="X48c517921ac74c40755f2dc42874752b45ab423"/>
+    <w:bookmarkEnd w:id="84"/>
+    <w:bookmarkStart w:id="85" w:name="X48c517921ac74c40755f2dc42874752b45ab423"/>
     <w:p>
       <w:pPr>
         <w:pStyle w:val="Heading2"/>
@@ -6849,8 +7107,8 @@
         <w:t xml:space="preserve">for covered applications, no direct group-membership assignments remain — every entitlement resolves to a rule, an attribute, and a worker record; a test reorganization (one division renamed and re-parented in HR) propagates to groups and approvals with zero manual directory changes.</w:t>
       </w:r>
     </w:p>
-    <w:bookmarkEnd w:id="73"/>
-    <w:bookmarkStart w:id="74" w:name="the-program-at-a-glance"/>
+    <w:bookmarkEnd w:id="85"/>
+    <w:bookmarkStart w:id="86" w:name="the-program-at-a-glance"/>
     <w:p>
       <w:pPr>
         <w:pStyle w:val="Heading2"/>
@@ -7067,9 +7325,9 @@
         <w:t xml:space="preserve">The sequence deliberately front-loads the unglamorous work. Phases 1 and 2 produce no visible change for end users — which is precisely why estates skip them, automate against unverified data in month one, and spend year two explaining to their assessor why the automation deprovisioned a regional director. Truth first, pipe second, actions third, derivations last.</w:t>
       </w:r>
     </w:p>
-    <w:bookmarkEnd w:id="74"/>
-    <w:bookmarkEnd w:id="75"/>
-    <w:bookmarkStart w:id="78" w:name="nist-sp-800-53-rev-5-control-closure"/>
+    <w:bookmarkEnd w:id="86"/>
+    <w:bookmarkEnd w:id="87"/>
+    <w:bookmarkStart w:id="90" w:name="nist-sp-800-53-rev-5-control-closure"/>
     <w:p>
       <w:pPr>
         <w:pStyle w:val="Heading1"/>
@@ -7780,12 +8038,12 @@
                 <wp:inline>
                   <wp:extent cx="152400" cy="152400"/>
                   <wp:effectExtent b="0" l="0" r="0" t="0"/>
-                  <wp:docPr descr="" title="" id="76" name="Picture"/>
+                  <wp:docPr descr="" title="" id="88" name="Picture"/>
                   <a:graphic>
                     <a:graphicData uri="http://schemas.openxmlformats.org/drawingml/2006/picture">
                       <pic:pic>
                         <pic:nvPicPr>
-                          <pic:cNvPr descr="/opt/quarto/share/formats/docx/note.png" id="77" name="Picture"/>
+                          <pic:cNvPr descr="C:\Program Files\Quarto\share\formats\docx\note.png" id="89" name="Picture"/>
                           <pic:cNvPicPr>
                             <a:picLocks noChangeArrowheads="1" noChangeAspect="1"/>
                           </pic:cNvPicPr>
@@ -7938,7 +8196,7 @@
             <w:r>
               <w:t xml:space="preserve"> </w:t>
             </w:r>
-            <w:hyperlink r:id="rId65">
+            <w:hyperlink r:id="rId73">
               <w:r>
                 <w:rPr>
                   <w:rStyle w:val="Hyperlink"/>
@@ -7957,8 +8215,8 @@
         </w:tc>
       </w:tr>
     </w:tbl>
-    <w:bookmarkEnd w:id="78"/>
-    <w:bookmarkStart w:id="80" w:name="series-context-part-4-of-19"/>
+    <w:bookmarkEnd w:id="90"/>
+    <w:bookmarkStart w:id="92" w:name="series-context-part-4-of-19"/>
     <w:p>
       <w:pPr>
         <w:pStyle w:val="Heading1"/>
@@ -8112,7 +8370,7 @@
       <w:r>
         <w:t xml:space="preserve"> </w:t>
       </w:r>
-      <w:hyperlink r:id="rId64">
+      <w:hyperlink r:id="rId72">
         <w:r>
           <w:rPr>
             <w:rStyle w:val="Hyperlink"/>
@@ -8126,7 +8384,7 @@
       <w:r>
         <w:t xml:space="preserve"> </w:t>
       </w:r>
-      <w:hyperlink r:id="rId65">
+      <w:hyperlink r:id="rId73">
         <w:r>
           <w:rPr>
             <w:rStyle w:val="Hyperlink"/>
@@ -8141,7 +8399,7 @@
         <w:t xml:space="preserve">packages the lifecycle evidence this book emits.</w:t>
       </w:r>
     </w:p>
-    <w:bookmarkStart w:id="79" w:name="Xad7833ad9d3f8a98c7b789d14bc1caec63be7d1"/>
+    <w:bookmarkStart w:id="91" w:name="Xad7833ad9d3f8a98c7b789d14bc1caec63be7d1"/>
     <w:p>
       <w:pPr>
         <w:pStyle w:val="Heading2"/>
@@ -8389,8 +8647,8 @@
         <w:t xml:space="preserve">Federal Application-Aware Networking — Part 4 of 19. Parts 1–3 established the naming plane, device identity, and cryptographic identity; Part 4 establishes the human and organizational source of truth they assert. Parts 5–19 apply this four-part substrate to transport, applications, operations, and the authorization package.</w:t>
       </w:r>
     </w:p>
-    <w:bookmarkEnd w:id="79"/>
-    <w:bookmarkEnd w:id="80"/>
+    <w:bookmarkEnd w:id="91"/>
+    <w:bookmarkEnd w:id="92"/>
     <w:sectPr>
       <w:footnotePr>
         <w:numRestart w:val="eachSect"/>

</xml_diff>